<commit_message>
formatting changes and add gitignore
</commit_message>
<xml_diff>
--- a/A Practical Guide to Using Bayesian Statistics.docx
+++ b/A Practical Guide to Using Bayesian Statistics.docx
@@ -52,36 +52,38 @@
     </w:p>
     <w:p>
       <w:pPr>
-        <w:pStyle w:val="Abstract-Label"/>
-      </w:pPr>
-      <w:r>
-        <w:t xml:space="preserve">Abstract</w:t>
-      </w:r>
-    </w:p>
-    <w:p>
-      <w:pPr>
         <w:pStyle w:val="Abstract"/>
-      </w:pPr>
-      <w:r>
-        <w:t xml:space="preserve">This paper seeks to provide a practical guide for actuaries to leverage Bayesian methods, as well as a discussion on behavioral economics as a motivating force.</w:t>
-      </w:r>
-    </w:p>
-    <w:p>
-      <w:pPr>
-        <w:pStyle w:val="BodyText"/>
       </w:pPr>
       <w:r>
         <w:rPr>
           <w:b/>
           <w:bCs/>
         </w:rPr>
-        <w:t xml:space="preserve">Keywords</w:t>
-      </w:r>
-      <w:r>
-        <w:t xml:space="preserve"> </w:t>
-      </w:r>
-      <w:r>
-        <w:t xml:space="preserve">— Bayesian Statistics, Monte Carlo, Markov Chain, MCMC, Stan, Forecasting, Predictions, Behavioral Economics</w:t>
+        <w:t xml:space="preserve">Abstract:</w:t>
+      </w:r>
+      <w:r>
+        <w:t xml:space="preserve"> </w:t>
+      </w:r>
+      <w:r>
+        <w:t xml:space="preserve">This paper seeks to provide a practical guide for actuaries to leverage Bayesian methods, as well as a discussion on behavioral economics as a motivating force.</w:t>
+      </w:r>
+    </w:p>
+    <w:p>
+      <w:pPr>
+        <w:pStyle w:val="Abstract"/>
+      </w:pPr>
+      <w:r>
+        <w:rPr>
+          <w:b/>
+          <w:bCs/>
+        </w:rPr>
+        <w:t xml:space="preserve">Keywords:</w:t>
+      </w:r>
+      <w:r>
+        <w:t xml:space="preserve"> </w:t>
+      </w:r>
+      <w:r>
+        <w:t xml:space="preserve">Bayesian Statistics, Monte Carlo, Markov Chain, MCMC, Stan, Forecasting, Predictions, Behavioral Economics, Bias</w:t>
       </w:r>
     </w:p>
     <w:bookmarkStart w:id="20" w:name="introduction"/>
@@ -98,7 +100,7 @@
         <w:pStyle w:val="FirstParagraph"/>
       </w:pPr>
       <w:r>
-        <w:t xml:space="preserve">Much has been written in the actuarial literature about Bayesian statistical methods over the last couple decades, few of which are still part of current exam syllabi. While these papers provide a thorough explanation of the process, the math can seem overly complex even to an experienced actuary. The purpose of this paper is twofold. First, we want to provide property &amp; casualty actuaries with a</w:t>
+        <w:t xml:space="preserve">Much has been written in the actuarial literature about Bayesian statistical methods over the last couple decades, few of which are still part of current CAS exam syllabi. While these papers provide a thorough explanation of the process, the math can seem overly complex even to an experienced actuary. The purpose of this paper is twofold. First, we want to provide property &amp; casualty actuaries with a</w:t>
       </w:r>
       <w:r>
         <w:t xml:space="preserve"> </w:t>
@@ -210,7 +212,7 @@
         <w:pStyle w:val="BodyText"/>
       </w:pPr>
       <w:r>
-        <w:t xml:space="preserve">In Section 6, we provide the reader with additional resources to further explore these topics.</w:t>
+        <w:t xml:space="preserve">In Section 6, we provide our conclusion and the reader with additional resources to further explore these topics.</w:t>
       </w:r>
     </w:p>
     <w:p>
@@ -218,7 +220,7 @@
         <w:pStyle w:val="BodyText"/>
       </w:pPr>
       <w:r>
-        <w:t xml:space="preserve">This paper was written using R Markdown. The underlying code is available as a supplementary file. Sample code for setting up a possible model is included as a supplementary file.</w:t>
+        <w:t xml:space="preserve">This paper was written using R Markdown. The underlying code is available as a supplementary file. Sample code for setting up a possible model is also included as a supplementary file.</w:t>
       </w:r>
     </w:p>
     <w:bookmarkEnd w:id="20"/>
@@ -257,13 +259,17 @@
         <w:t xml:space="preserve"> </w:t>
       </w:r>
       <w:r>
-        <w:t xml:space="preserve">“Judgment Under Uncertainty: Heuristics and Biases”</w:t>
-      </w:r>
-      <w:r>
-        <w:t xml:space="preserve"> </w:t>
-      </w:r>
-      <w:r>
-        <w:t xml:space="preserve">by Tversky &amp; Kahnemann.</w:t>
+        <w:rPr>
+          <w:i/>
+          <w:iCs/>
+        </w:rPr>
+        <w:t xml:space="preserve">Judgment Under Uncertainty: Heuristics and Biases</w:t>
+      </w:r>
+      <w:r>
+        <w:t xml:space="preserve"> </w:t>
+      </w:r>
+      <w:r>
+        <w:t xml:space="preserve">(Tversky &amp; Kahnemann).</w:t>
       </w:r>
     </w:p>
     <w:bookmarkStart w:id="21" w:name="insensitivity-to-sample-size"/>
@@ -272,7 +278,7 @@
         <w:pStyle w:val="Heading2"/>
       </w:pPr>
       <w:r>
-        <w:t xml:space="preserve">2.1 Insensitivity to Sample Size</w:t>
+        <w:t xml:space="preserve">2.1. Insensitivity to Sample Size</w:t>
       </w:r>
     </w:p>
     <w:p>
@@ -354,7 +360,7 @@
         <w:pStyle w:val="Heading2"/>
       </w:pPr>
       <w:r>
-        <w:t xml:space="preserve">2.2 Insensitivity to the Prior Probability of Outcomes</w:t>
+        <w:t xml:space="preserve">2.2. Insensitivity to the Prior Probability of Outcomes</w:t>
       </w:r>
     </w:p>
     <w:p>
@@ -370,7 +376,23 @@
         <w:pStyle w:val="BodyText"/>
       </w:pPr>
       <w:r>
-        <w:t xml:space="preserve">For example, when subjects were tasked with evaluating the likelihood of whether a randomly sampled person out of a pool of 30 engineers and 70 lawyers was a lawyer or an engineer, subjects correctly identified the relative likelihoods (30% &amp; 70%). However, when the following description of the randomly sampled person was introduced, subjects</w:t>
+        <w:t xml:space="preserve">For example, when subjects were tasked with evaluating the likelihood of whether a randomly sampled person out of a pool of 30 engineers and 70 lawyers was a lawyer or an engineer, subjects correctly identified the relative likelihoods (30% &amp; 70%). However, this was not the case when subjects were also given a description of the randomly sampled person was introduced. Consider the following description:</w:t>
+      </w:r>
+    </w:p>
+    <w:p>
+      <w:pPr>
+        <w:pStyle w:val="BlockText"/>
+      </w:pPr>
+      <w:r>
+        <w:t xml:space="preserve">Dick is a 30-year old man. He is married with no children. A man of high ability and high motivation, he promises to be quite successful in his field. He is well liked by his colleagues.</w:t>
+      </w:r>
+    </w:p>
+    <w:p>
+      <w:pPr>
+        <w:pStyle w:val="FirstParagraph"/>
+      </w:pPr>
+      <w:r>
+        <w:t xml:space="preserve">When presented with this description, subjects</w:t>
       </w:r>
       <w:r>
         <w:t xml:space="preserve"> </w:t>
@@ -381,15 +403,7 @@
     </w:p>
     <w:p>
       <w:pPr>
-        <w:pStyle w:val="BlockText"/>
-      </w:pPr>
-      <w:r>
-        <w:t xml:space="preserve">Dick is a 30-year old man. He is married with no children. A man of high ability and high motivation, he promises to be quite successful in his field. He is well liked by his colleagues.</w:t>
-      </w:r>
-    </w:p>
-    <w:p>
-      <w:pPr>
-        <w:pStyle w:val="FirstParagraph"/>
+        <w:pStyle w:val="BodyText"/>
       </w:pPr>
       <w:r>
         <w:t xml:space="preserve">When presented with the seemingly uninformative description, subjects now estimated the relative likelihoods to be equal (50% &amp; 50%). That is, they ignored the distribution of professions from the population (30% &amp; 70%). Even though the description offers no clue as to what profession Dick might belong to, subjects ignored the distribution of professions for the populations.</w:t>
@@ -410,7 +424,7 @@
         <w:pStyle w:val="Heading2"/>
       </w:pPr>
       <w:r>
-        <w:t xml:space="preserve">2.3 Misconception of Chance</w:t>
+        <w:t xml:space="preserve">2.3. Misconception of Chance</w:t>
       </w:r>
     </w:p>
     <w:p>
@@ -507,7 +521,7 @@
         <w:pStyle w:val="Heading2"/>
       </w:pPr>
       <w:r>
-        <w:t xml:space="preserve">2.4 Insensitivity to Predictive Accuracy</w:t>
+        <w:t xml:space="preserve">2.4. Insensitivity to Predictive Accuracy</w:t>
       </w:r>
     </w:p>
     <w:p>
@@ -545,7 +559,7 @@
         <w:pStyle w:val="Heading2"/>
       </w:pPr>
       <w:r>
-        <w:t xml:space="preserve">2.5 Regression to the Mean</w:t>
+        <w:t xml:space="preserve">2.5. Regression to the Mean</w:t>
       </w:r>
     </w:p>
     <w:p>
@@ -553,7 +567,7 @@
         <w:pStyle w:val="FirstParagraph"/>
       </w:pPr>
       <w:r>
-        <w:t xml:space="preserve">If we observe a higher-than-average value sampled from a known distribution, then one might expect the next sample to be closer to average. However, studies show that many subjects do not always recognize this phenomenon. They can either fail to believe regression is applicable in their specific scenario or they might</w:t>
+        <w:t xml:space="preserve">If we observe a higher-than-average value sampled from a known distribution, then one might expect the next sample to be closer to average. However, studies show that many subjects do not always recognize this phenomenon. They can either fail to believe regression is applicable in their specific scenario, or they might</w:t>
       </w:r>
       <w:r>
         <w:t xml:space="preserve"> </w:t>
@@ -567,7 +581,7 @@
         <w:pStyle w:val="BodyText"/>
       </w:pPr>
       <w:r>
-        <w:t xml:space="preserve">In the case of forecasting losses, one might experience this phenomenon. Suppose losses are generally stable year-over-year, but the most recent year unexpectedly dropped 20% relative to the prior year. How much weight should we give this possible outlier? Do we give the most weight to the average? While there is no right answer, being aware of this potential bias will allow you to make a more well-informed decision.</w:t>
+        <w:t xml:space="preserve">In the case of forecasting losses, one might experience this phenomenon. Suppose losses are generally stable year-over-year, but the most recent year unexpectedly dropped 20% relative to the prior year. How much weight should we give this possible outlier? Do we give more weight to the longer-term average? While there is no right answer, being aware of this potential bias will allow you to make a more well-informed decision.</w:t>
       </w:r>
     </w:p>
     <w:bookmarkEnd w:id="25"/>
@@ -577,7 +591,7 @@
         <w:pStyle w:val="Heading2"/>
       </w:pPr>
       <w:r>
-        <w:t xml:space="preserve">2.6 Anchoring</w:t>
+        <w:t xml:space="preserve">2.6. Anchoring</w:t>
       </w:r>
     </w:p>
     <w:p>
@@ -585,7 +599,7 @@
         <w:pStyle w:val="FirstParagraph"/>
       </w:pPr>
       <w:r>
-        <w:t xml:space="preserve">In one study, subjects were tasked with estimating the percentage of African countries in the United Nations. Before making their estimate, the subjects were asked to spin a wheel with numbers from 0 to 100. The subjects had to adjust upwards or downwards from this starting value. The median estimate for those with a starting value of 10 was 25%. When the starting value was 65, the median estimate increased to 45%. This example illustrates the concept of anchoring, which is where some initial value influences the estimated value.</w:t>
+        <w:t xml:space="preserve">In one study, subjects were tasked with estimating the percentage of African countries in the United Nations. Before making their estimate, the subjects were asked to spin a wheel with numbers from 0 to 100. The subjects had to adjust upwards or downwards from this starting value. The median estimate for those with a starting value of 10 was 25%. However, for those with a starting value of 65, they had a significantly higher median estimate of 45%. This example illustrates the concept of anchoring, which is where some initial value influences the estimated value.</w:t>
       </w:r>
     </w:p>
     <w:p>
@@ -634,7 +648,7 @@
         <w:pStyle w:val="Heading2"/>
       </w:pPr>
       <w:r>
-        <w:t xml:space="preserve">3.1 Background</w:t>
+        <w:t xml:space="preserve">3.1. Background</w:t>
       </w:r>
     </w:p>
     <w:p>
@@ -725,6 +739,14 @@
         <w:t xml:space="preserve">Insufficient Parameter Identification: Results when we fail to consider the uncertainty of our model elements.</w:t>
       </w:r>
     </w:p>
+    <w:p>
+      <w:pPr>
+        <w:pStyle w:val="FirstParagraph"/>
+      </w:pPr>
+      <w:r>
+        <w:t xml:space="preserve">These risks are one reason why reserving actuaries often provide a range of reasonable estimates along with their point estimates.</w:t>
+      </w:r>
+    </w:p>
     <w:bookmarkEnd w:id="28"/>
     <w:bookmarkStart w:id="29" w:name="statistical-schools-of-thought"/>
     <w:p>
@@ -732,7 +754,7 @@
         <w:pStyle w:val="Heading2"/>
       </w:pPr>
       <w:r>
-        <w:t xml:space="preserve">3.2 Statistical Schools of Thought</w:t>
+        <w:t xml:space="preserve">3.2. Statistical Schools of Thought</w:t>
       </w:r>
     </w:p>
     <w:p>
@@ -756,7 +778,7 @@
         <w:pStyle w:val="BodyText"/>
       </w:pPr>
       <w:r>
-        <w:t xml:space="preserve">Bayesian statistics may sound familiar to you, as the core of Bayesian statistics is an idea called Bayes’ theorem, which most actuaries would have learned in an introductory statistics course.</w:t>
+        <w:t xml:space="preserve">Bayesian statistics may sound familiar to you, as the core of Bayesian statistics is an idea called Bayes’ theorem, which most actuaries would have learned in an introductory statistics course and is on the CAS Exam P/1 syllabus. We will explore Bayesian statistics further in Section 4.</w:t>
       </w:r>
     </w:p>
     <w:p>
@@ -764,10 +786,96 @@
         <w:pStyle w:val="BodyText"/>
       </w:pPr>
       <w:r>
-        <w:t xml:space="preserve">Most people, and specifically actuaries, rely on frequentist statistics for their analyses. Some of the main distinctions between the two types of inference are:</w:t>
-      </w:r>
-    </w:p>
-    <w:tbl xmlns:w="http://schemas.openxmlformats.org/wordprocessingml/2006/main" xmlns:r="http://schemas.openxmlformats.org/officeDocument/2006/relationships" xmlns:w14="http://schemas.microsoft.com/office/word/2010/wordml" xmlns:wp="http://schemas.openxmlformats.org/drawingml/2006/wordprocessingDrawing" xmlns:a="http://schemas.openxmlformats.org/drawingml/2006/main" xmlns:pic="http://schemas.openxmlformats.org/drawingml/2006/picture">
+        <w:t xml:space="preserve">Most people, and specifically actuaries, rely on frequentist statistics for their analyses. Some of the main distinctions between the two types of inference are listed below in</w:t>
+      </w:r>
+      <w:r>
+        <w:t xml:space="preserve"> </w:t>
+      </w:r>
+      <w:r>
+        <w:rPr>
+          <w:b/>
+          <w:bCs/>
+        </w:rPr>
+        <w:t xml:space="preserve">Table</w:t>
+      </w:r>
+      <w:r>
+        <w:rPr>
+          <w:b/>
+          <w:bCs/>
+        </w:rPr>
+        <w:t xml:space="preserve"> </w:t>
+      </w:r>
+      <w:hyperlink w:anchor="freq_vs_bayes">
+        <w:r xmlns:w14="http://schemas.microsoft.com/office/word/2010/wordml">
+          <w:rPr/>
+          <w:fldChar w:fldCharType="begin" w:dirty="true"/>
+        </w:r>
+        <w:r xmlns:w14="http://schemas.microsoft.com/office/word/2010/wordml">
+          <w:rPr/>
+          <w:instrText xml:space="preserve" w:dirty="true"> REF freq_vs_bayes \h</w:instrText>
+        </w:r>
+        <w:r xmlns:w14="http://schemas.microsoft.com/office/word/2010/wordml">
+          <w:rPr/>
+          <w:fldChar w:fldCharType="end" w:dirty="true"/>
+        </w:r>
+      </w:hyperlink>
+      <w:r>
+        <w:t xml:space="preserve">:</w:t>
+      </w:r>
+    </w:p>
+    <w:p xmlns:w14="http://schemas.microsoft.com/office/word/2010/wordml">
+      <w:pPr>
+        <w:pStyle w:val="TableCaption"/>
+        <w:jc w:val="center"/>
+        <w:keepNext/>
+      </w:pPr>
+      <w:r>
+        <w:rPr>
+          <w:rFonts/>
+          <w:b w:val="true"/>
+          <w:strike w:val="false"/>
+        </w:rPr>
+        <w:t xml:space="preserve">Table </w:t>
+      </w:r>
+      <w:bookmarkStart w:id="92628d18-2cdb-4e04-86d4-e0f21775a45a" w:name="freq_vs_bayes"/>
+      <w:r>
+        <w:rPr>
+          <w:rFonts/>
+          <w:b w:val="true"/>
+          <w:strike w:val="false"/>
+        </w:rPr>
+        <w:fldChar w:fldCharType="begin" w:dirty="true"/>
+      </w:r>
+      <w:r>
+        <w:rPr>
+          <w:rFonts/>
+          <w:b w:val="true"/>
+          <w:strike w:val="false"/>
+        </w:rPr>
+        <w:instrText xml:space="preserve" w:dirty="true">SEQ tab \* Arabic</w:instrText>
+      </w:r>
+      <w:r>
+        <w:rPr>
+          <w:rFonts/>
+          <w:b w:val="true"/>
+          <w:strike w:val="false"/>
+        </w:rPr>
+        <w:fldChar w:fldCharType="end" w:dirty="true"/>
+      </w:r>
+      <w:bookmarkEnd w:id="92628d18-2cdb-4e04-86d4-e0f21775a45a"/>
+      <w:r>
+        <w:rPr>
+          <w:rFonts/>
+          <w:b w:val="true"/>
+          <w:strike w:val="false"/>
+        </w:rPr>
+        <w:t xml:space="preserve">: </w:t>
+      </w:r>
+      <w:r>
+        <w:t xml:space="preserve">Frequentist vs Bayesian</w:t>
+      </w:r>
+    </w:p>
+    <w:tbl xmlns:w14="http://schemas.microsoft.com/office/word/2010/wordml">
       <w:tblPr>
         <w:tblLayout w:type="fixed"/>
         <w:jc w:val="center"/>
@@ -789,6 +897,114 @@
               <w:bottom w:val="single" w:sz="12" w:space="0" w:color="666666"/>
               <w:top w:val="single" w:sz="12" w:space="0" w:color="666666"/>
               <w:left w:val="none" w:sz="0" w:space="0" w:color="000000"/>
+              <w:right w:val="single" w:sz="8" w:space="0" w:color="666666"/>
+            </w:tcBorders>
+            <w:shd w:val="clear" w:color="auto" w:fill="FFFFFF"/>
+            <w:tcMar>
+              <w:top w:w="0" w:type="dxa"/>
+              <w:bottom w:w="0" w:type="dxa"/>
+              <w:left w:w="0" w:type="dxa"/>
+              <w:right w:w="0" w:type="dxa"/>
+            </w:tcMar>
+            <w:vAlign w:val="center"/>
+          </w:tcPr>
+          <w:p>
+            <w:pPr>
+              <w:jc w:val="left"/>
+              <w:pBdr>
+                <w:bottom w:val="none" w:sz="0" w:space="0" w:color="000000"/>
+                <w:top w:val="none" w:sz="0" w:space="0" w:color="000000"/>
+                <w:left w:val="none" w:sz="0" w:space="0" w:color="000000"/>
+                <w:right w:val="none" w:sz="0" w:space="0" w:color="000000"/>
+              </w:pBdr>
+              <w:spacing w:after="100" w:before="100" w:line="240"/>
+              <w:ind w:left="100" w:right="100" w:firstLine="0" w:firstLineChars="0"/>
+              <w:rPr>
+                <w:rFonts w:ascii="Arial" w:hAnsi="Arial" w:eastAsia="Arial" w:cs="Arial"/>
+                <w:i w:val="false"/>
+                <w:b w:val="false"/>
+                <w:u w:val="none"/>
+                <w:strike w:val="false"/>
+                <w:sz w:val="22"/>
+                <w:szCs w:val="22"/>
+                <w:color w:val="000000"/>
+              </w:rPr>
+            </w:pPr>
+            <w:r>
+              <w:rPr>
+                <w:rFonts w:ascii="Arial" w:hAnsi="Arial" w:eastAsia="Arial" w:cs="Arial"/>
+                <w:i w:val="false"/>
+                <w:b w:val="false"/>
+                <w:u w:val="none"/>
+                <w:strike w:val="false"/>
+                <w:sz w:val="22"/>
+                <w:szCs w:val="22"/>
+                <w:color w:val="000000"/>
+              </w:rPr>
+              <w:t xml:space="preserve">Component</w:t>
+            </w:r>
+          </w:p>
+        </w:tc>
+        <w:tc>
+          <w:tcPr>
+            <w:tcBorders>
+              <w:bottom w:val="single" w:sz="12" w:space="0" w:color="666666"/>
+              <w:top w:val="single" w:sz="12" w:space="0" w:color="666666"/>
+              <w:left w:val="single" w:sz="8" w:space="0" w:color="666666"/>
+              <w:right w:val="single" w:sz="8" w:space="0" w:color="666666"/>
+            </w:tcBorders>
+            <w:shd w:val="clear" w:color="auto" w:fill="FFFFFF"/>
+            <w:tcMar>
+              <w:top w:w="0" w:type="dxa"/>
+              <w:bottom w:w="0" w:type="dxa"/>
+              <w:left w:w="0" w:type="dxa"/>
+              <w:right w:w="0" w:type="dxa"/>
+            </w:tcMar>
+            <w:vAlign w:val="center"/>
+          </w:tcPr>
+          <w:p>
+            <w:pPr>
+              <w:jc w:val="left"/>
+              <w:pBdr>
+                <w:bottom w:val="none" w:sz="0" w:space="0" w:color="000000"/>
+                <w:top w:val="none" w:sz="0" w:space="0" w:color="000000"/>
+                <w:left w:val="none" w:sz="0" w:space="0" w:color="000000"/>
+                <w:right w:val="none" w:sz="0" w:space="0" w:color="000000"/>
+              </w:pBdr>
+              <w:spacing w:after="100" w:before="100" w:line="240"/>
+              <w:ind w:left="100" w:right="100" w:firstLine="0" w:firstLineChars="0"/>
+              <w:rPr>
+                <w:rFonts w:ascii="Arial" w:hAnsi="Arial" w:eastAsia="Arial" w:cs="Arial"/>
+                <w:i w:val="false"/>
+                <w:b w:val="false"/>
+                <w:u w:val="none"/>
+                <w:strike w:val="false"/>
+                <w:sz w:val="22"/>
+                <w:szCs w:val="22"/>
+                <w:color w:val="000000"/>
+              </w:rPr>
+            </w:pPr>
+            <w:r>
+              <w:rPr>
+                <w:rFonts w:ascii="Arial" w:hAnsi="Arial" w:eastAsia="Arial" w:cs="Arial"/>
+                <w:i w:val="false"/>
+                <w:b w:val="false"/>
+                <w:u w:val="none"/>
+                <w:strike w:val="false"/>
+                <w:sz w:val="22"/>
+                <w:szCs w:val="22"/>
+                <w:color w:val="000000"/>
+              </w:rPr>
+              <w:t xml:space="preserve">Frequentist</w:t>
+            </w:r>
+          </w:p>
+        </w:tc>
+        <w:tc>
+          <w:tcPr>
+            <w:tcBorders>
+              <w:bottom w:val="single" w:sz="12" w:space="0" w:color="666666"/>
+              <w:top w:val="single" w:sz="12" w:space="0" w:color="666666"/>
+              <w:left w:val="single" w:sz="8" w:space="0" w:color="666666"/>
               <w:right w:val="none" w:sz="0" w:space="0" w:color="000000"/>
             </w:tcBorders>
             <w:shd w:val="clear" w:color="auto" w:fill="FFFFFF"/>
@@ -822,7 +1038,7 @@
                 <w:color w:val="000000"/>
               </w:rPr>
             </w:pPr>
-            <w:r xmlns:w="http://schemas.openxmlformats.org/wordprocessingml/2006/main" xmlns:wp="http://schemas.openxmlformats.org/drawingml/2006/wordprocessingDrawing" xmlns:r="http://schemas.openxmlformats.org/officeDocument/2006/relationships" xmlns:w14="http://schemas.microsoft.com/office/word/2010/wordml">
+            <w:r>
               <w:rPr>
                 <w:rFonts w:ascii="Arial" w:hAnsi="Arial" w:eastAsia="Arial" w:cs="Arial"/>
                 <w:i w:val="false"/>
@@ -833,16 +1049,129 @@
                 <w:szCs w:val="22"/>
                 <w:color w:val="000000"/>
               </w:rPr>
-              <w:t xml:space="preserve">Component</w:t>
+              <w:t xml:space="preserve">Bayesian</w:t>
+            </w:r>
+          </w:p>
+        </w:tc>
+      </w:tr>
+      <w:tr>
+        <w:trPr>
+          <w:trHeight w:val="360" w:hRule="auto"/>
+        </w:trPr>
+        <w:tc>
+          <w:tcPr>
+            <w:tcBorders>
+              <w:bottom w:val="single" w:sz="8" w:space="0" w:color="666666"/>
+              <w:top w:val="single" w:sz="12" w:space="0" w:color="666666"/>
+              <w:left w:val="none" w:sz="0" w:space="0" w:color="000000"/>
+              <w:right w:val="single" w:sz="8" w:space="0" w:color="666666"/>
+            </w:tcBorders>
+            <w:shd w:val="clear" w:color="auto" w:fill="FFFFFF"/>
+            <w:tcMar>
+              <w:top w:w="0" w:type="dxa"/>
+              <w:bottom w:w="0" w:type="dxa"/>
+              <w:left w:w="0" w:type="dxa"/>
+              <w:right w:w="0" w:type="dxa"/>
+            </w:tcMar>
+            <w:vAlign w:val="center"/>
+          </w:tcPr>
+          <w:p>
+            <w:pPr>
+              <w:jc w:val="left"/>
+              <w:pBdr>
+                <w:bottom w:val="none" w:sz="0" w:space="0" w:color="000000"/>
+                <w:top w:val="none" w:sz="0" w:space="0" w:color="000000"/>
+                <w:left w:val="none" w:sz="0" w:space="0" w:color="000000"/>
+                <w:right w:val="none" w:sz="0" w:space="0" w:color="000000"/>
+              </w:pBdr>
+              <w:spacing w:after="100" w:before="100" w:line="240"/>
+              <w:ind w:left="100" w:right="100" w:firstLine="0" w:firstLineChars="0"/>
+              <w:rPr>
+                <w:rFonts w:ascii="Arial" w:hAnsi="Arial" w:eastAsia="Arial" w:cs="Arial"/>
+                <w:i w:val="false"/>
+                <w:b w:val="false"/>
+                <w:u w:val="none"/>
+                <w:strike w:val="false"/>
+                <w:sz w:val="22"/>
+                <w:szCs w:val="22"/>
+                <w:color w:val="000000"/>
+              </w:rPr>
+            </w:pPr>
+            <w:r>
+              <w:rPr>
+                <w:rFonts w:ascii="Arial" w:hAnsi="Arial" w:eastAsia="Arial" w:cs="Arial"/>
+                <w:i w:val="false"/>
+                <w:b w:val="false"/>
+                <w:u w:val="none"/>
+                <w:strike w:val="false"/>
+                <w:sz w:val="22"/>
+                <w:szCs w:val="22"/>
+                <w:color w:val="000000"/>
+              </w:rPr>
+              <w:t xml:space="preserve">Observed Data</w:t>
             </w:r>
           </w:p>
         </w:tc>
         <w:tc>
           <w:tcPr>
             <w:tcBorders>
-              <w:bottom w:val="single" w:sz="12" w:space="0" w:color="666666"/>
+              <w:bottom w:val="single" w:sz="8" w:space="0" w:color="666666"/>
               <w:top w:val="single" w:sz="12" w:space="0" w:color="666666"/>
-              <w:left w:val="none" w:sz="0" w:space="0" w:color="000000"/>
+              <w:left w:val="single" w:sz="8" w:space="0" w:color="666666"/>
+              <w:right w:val="single" w:sz="8" w:space="0" w:color="666666"/>
+            </w:tcBorders>
+            <w:shd w:val="clear" w:color="auto" w:fill="FFFFFF"/>
+            <w:tcMar>
+              <w:top w:w="0" w:type="dxa"/>
+              <w:bottom w:w="0" w:type="dxa"/>
+              <w:left w:w="0" w:type="dxa"/>
+              <w:right w:w="0" w:type="dxa"/>
+            </w:tcMar>
+            <w:vAlign w:val="center"/>
+          </w:tcPr>
+          <w:p>
+            <w:pPr>
+              <w:jc w:val="left"/>
+              <w:pBdr>
+                <w:bottom w:val="none" w:sz="0" w:space="0" w:color="000000"/>
+                <w:top w:val="none" w:sz="0" w:space="0" w:color="000000"/>
+                <w:left w:val="none" w:sz="0" w:space="0" w:color="000000"/>
+                <w:right w:val="none" w:sz="0" w:space="0" w:color="000000"/>
+              </w:pBdr>
+              <w:spacing w:after="100" w:before="100" w:line="240"/>
+              <w:ind w:left="100" w:right="100" w:firstLine="0" w:firstLineChars="0"/>
+              <w:rPr>
+                <w:rFonts w:ascii="Arial" w:hAnsi="Arial" w:eastAsia="Arial" w:cs="Arial"/>
+                <w:i w:val="false"/>
+                <w:b w:val="false"/>
+                <w:u w:val="none"/>
+                <w:strike w:val="false"/>
+                <w:sz w:val="22"/>
+                <w:szCs w:val="22"/>
+                <w:color w:val="000000"/>
+              </w:rPr>
+            </w:pPr>
+            <w:r>
+              <w:rPr>
+                <w:rFonts w:ascii="Arial" w:hAnsi="Arial" w:eastAsia="Arial" w:cs="Arial"/>
+                <w:i w:val="false"/>
+                <w:b w:val="false"/>
+                <w:u w:val="none"/>
+                <w:strike w:val="false"/>
+                <w:sz w:val="22"/>
+                <w:szCs w:val="22"/>
+                <w:color w:val="000000"/>
+              </w:rPr>
+              <w:t xml:space="preserve">Repeatable and random events</w:t>
+            </w:r>
+          </w:p>
+        </w:tc>
+        <w:tc>
+          <w:tcPr>
+            <w:tcBorders>
+              <w:bottom w:val="single" w:sz="8" w:space="0" w:color="666666"/>
+              <w:top w:val="single" w:sz="12" w:space="0" w:color="666666"/>
+              <w:left w:val="single" w:sz="8" w:space="0" w:color="666666"/>
               <w:right w:val="none" w:sz="0" w:space="0" w:color="000000"/>
             </w:tcBorders>
             <w:shd w:val="clear" w:color="auto" w:fill="FFFFFF"/>
@@ -876,7 +1205,7 @@
                 <w:color w:val="000000"/>
               </w:rPr>
             </w:pPr>
-            <w:r xmlns:w="http://schemas.openxmlformats.org/wordprocessingml/2006/main" xmlns:wp="http://schemas.openxmlformats.org/drawingml/2006/wordprocessingDrawing" xmlns:r="http://schemas.openxmlformats.org/officeDocument/2006/relationships" xmlns:w14="http://schemas.microsoft.com/office/word/2010/wordml">
+            <w:r>
               <w:rPr>
                 <w:rFonts w:ascii="Arial" w:hAnsi="Arial" w:eastAsia="Arial" w:cs="Arial"/>
                 <w:i w:val="false"/>
@@ -887,16 +1216,129 @@
                 <w:szCs w:val="22"/>
                 <w:color w:val="000000"/>
               </w:rPr>
-              <w:t xml:space="preserve">Frequentist</w:t>
+              <w:t xml:space="preserve">Known and fixed sample</w:t>
+            </w:r>
+          </w:p>
+        </w:tc>
+      </w:tr>
+      <w:tr>
+        <w:trPr>
+          <w:trHeight w:val="360" w:hRule="auto"/>
+        </w:trPr>
+        <w:tc>
+          <w:tcPr>
+            <w:tcBorders>
+              <w:bottom w:val="single" w:sz="8" w:space="0" w:color="666666"/>
+              <w:top w:val="single" w:sz="8" w:space="0" w:color="666666"/>
+              <w:left w:val="none" w:sz="0" w:space="0" w:color="000000"/>
+              <w:right w:val="single" w:sz="8" w:space="0" w:color="666666"/>
+            </w:tcBorders>
+            <w:shd w:val="clear" w:color="auto" w:fill="FFFFFF"/>
+            <w:tcMar>
+              <w:top w:w="0" w:type="dxa"/>
+              <w:bottom w:w="0" w:type="dxa"/>
+              <w:left w:w="0" w:type="dxa"/>
+              <w:right w:w="0" w:type="dxa"/>
+            </w:tcMar>
+            <w:vAlign w:val="center"/>
+          </w:tcPr>
+          <w:p>
+            <w:pPr>
+              <w:jc w:val="left"/>
+              <w:pBdr>
+                <w:bottom w:val="none" w:sz="0" w:space="0" w:color="000000"/>
+                <w:top w:val="none" w:sz="0" w:space="0" w:color="000000"/>
+                <w:left w:val="none" w:sz="0" w:space="0" w:color="000000"/>
+                <w:right w:val="none" w:sz="0" w:space="0" w:color="000000"/>
+              </w:pBdr>
+              <w:spacing w:after="100" w:before="100" w:line="240"/>
+              <w:ind w:left="100" w:right="100" w:firstLine="0" w:firstLineChars="0"/>
+              <w:rPr>
+                <w:rFonts w:ascii="Arial" w:hAnsi="Arial" w:eastAsia="Arial" w:cs="Arial"/>
+                <w:i w:val="false"/>
+                <w:b w:val="false"/>
+                <w:u w:val="none"/>
+                <w:strike w:val="false"/>
+                <w:sz w:val="22"/>
+                <w:szCs w:val="22"/>
+                <w:color w:val="000000"/>
+              </w:rPr>
+            </w:pPr>
+            <w:r>
+              <w:rPr>
+                <w:rFonts w:ascii="Arial" w:hAnsi="Arial" w:eastAsia="Arial" w:cs="Arial"/>
+                <w:i w:val="false"/>
+                <w:b w:val="false"/>
+                <w:u w:val="none"/>
+                <w:strike w:val="false"/>
+                <w:sz w:val="22"/>
+                <w:szCs w:val="22"/>
+                <w:color w:val="000000"/>
+              </w:rPr>
+              <w:t xml:space="preserve">Parameters</w:t>
             </w:r>
           </w:p>
         </w:tc>
         <w:tc>
           <w:tcPr>
             <w:tcBorders>
-              <w:bottom w:val="single" w:sz="12" w:space="0" w:color="666666"/>
-              <w:top w:val="single" w:sz="12" w:space="0" w:color="666666"/>
-              <w:left w:val="none" w:sz="0" w:space="0" w:color="000000"/>
+              <w:bottom w:val="single" w:sz="8" w:space="0" w:color="666666"/>
+              <w:top w:val="single" w:sz="8" w:space="0" w:color="666666"/>
+              <w:left w:val="single" w:sz="8" w:space="0" w:color="666666"/>
+              <w:right w:val="single" w:sz="8" w:space="0" w:color="666666"/>
+            </w:tcBorders>
+            <w:shd w:val="clear" w:color="auto" w:fill="FFFFFF"/>
+            <w:tcMar>
+              <w:top w:w="0" w:type="dxa"/>
+              <w:bottom w:w="0" w:type="dxa"/>
+              <w:left w:w="0" w:type="dxa"/>
+              <w:right w:w="0" w:type="dxa"/>
+            </w:tcMar>
+            <w:vAlign w:val="center"/>
+          </w:tcPr>
+          <w:p>
+            <w:pPr>
+              <w:jc w:val="left"/>
+              <w:pBdr>
+                <w:bottom w:val="none" w:sz="0" w:space="0" w:color="000000"/>
+                <w:top w:val="none" w:sz="0" w:space="0" w:color="000000"/>
+                <w:left w:val="none" w:sz="0" w:space="0" w:color="000000"/>
+                <w:right w:val="none" w:sz="0" w:space="0" w:color="000000"/>
+              </w:pBdr>
+              <w:spacing w:after="100" w:before="100" w:line="240"/>
+              <w:ind w:left="100" w:right="100" w:firstLine="0" w:firstLineChars="0"/>
+              <w:rPr>
+                <w:rFonts w:ascii="Arial" w:hAnsi="Arial" w:eastAsia="Arial" w:cs="Arial"/>
+                <w:i w:val="false"/>
+                <w:b w:val="false"/>
+                <w:u w:val="none"/>
+                <w:strike w:val="false"/>
+                <w:sz w:val="22"/>
+                <w:szCs w:val="22"/>
+                <w:color w:val="000000"/>
+              </w:rPr>
+            </w:pPr>
+            <w:r>
+              <w:rPr>
+                <w:rFonts w:ascii="Arial" w:hAnsi="Arial" w:eastAsia="Arial" w:cs="Arial"/>
+                <w:i w:val="false"/>
+                <w:b w:val="false"/>
+                <w:u w:val="none"/>
+                <w:strike w:val="false"/>
+                <w:sz w:val="22"/>
+                <w:szCs w:val="22"/>
+                <w:color w:val="000000"/>
+              </w:rPr>
+              <w:t xml:space="preserve">Fixed values</w:t>
+            </w:r>
+          </w:p>
+        </w:tc>
+        <w:tc>
+          <w:tcPr>
+            <w:tcBorders>
+              <w:bottom w:val="single" w:sz="8" w:space="0" w:color="666666"/>
+              <w:top w:val="single" w:sz="8" w:space="0" w:color="666666"/>
+              <w:left w:val="single" w:sz="8" w:space="0" w:color="666666"/>
               <w:right w:val="none" w:sz="0" w:space="0" w:color="000000"/>
             </w:tcBorders>
             <w:shd w:val="clear" w:color="auto" w:fill="FFFFFF"/>
@@ -930,7 +1372,7 @@
                 <w:color w:val="000000"/>
               </w:rPr>
             </w:pPr>
-            <w:r xmlns:w="http://schemas.openxmlformats.org/wordprocessingml/2006/main" xmlns:wp="http://schemas.openxmlformats.org/drawingml/2006/wordprocessingDrawing" xmlns:r="http://schemas.openxmlformats.org/officeDocument/2006/relationships" xmlns:w14="http://schemas.microsoft.com/office/word/2010/wordml">
+            <w:r>
               <w:rPr>
                 <w:rFonts w:ascii="Arial" w:hAnsi="Arial" w:eastAsia="Arial" w:cs="Arial"/>
                 <w:i w:val="false"/>
@@ -941,7 +1383,7 @@
                 <w:szCs w:val="22"/>
                 <w:color w:val="000000"/>
               </w:rPr>
-              <w:t xml:space="preserve">Bayesian</w:t>
+              <w:t xml:space="preserve">Unknown</w:t>
             </w:r>
           </w:p>
         </w:tc>
@@ -953,9 +1395,117 @@
         <w:tc>
           <w:tcPr>
             <w:tcBorders>
-              <w:bottom w:val="none" w:sz="0" w:space="0" w:color="000000"/>
-              <w:top w:val="single" w:sz="12" w:space="0" w:color="666666"/>
+              <w:bottom w:val="single" w:sz="8" w:space="0" w:color="666666"/>
+              <w:top w:val="single" w:sz="8" w:space="0" w:color="666666"/>
               <w:left w:val="none" w:sz="0" w:space="0" w:color="000000"/>
+              <w:right w:val="single" w:sz="8" w:space="0" w:color="666666"/>
+            </w:tcBorders>
+            <w:shd w:val="clear" w:color="auto" w:fill="FFFFFF"/>
+            <w:tcMar>
+              <w:top w:w="0" w:type="dxa"/>
+              <w:bottom w:w="0" w:type="dxa"/>
+              <w:left w:w="0" w:type="dxa"/>
+              <w:right w:w="0" w:type="dxa"/>
+            </w:tcMar>
+            <w:vAlign w:val="center"/>
+          </w:tcPr>
+          <w:p>
+            <w:pPr>
+              <w:jc w:val="left"/>
+              <w:pBdr>
+                <w:bottom w:val="none" w:sz="0" w:space="0" w:color="000000"/>
+                <w:top w:val="none" w:sz="0" w:space="0" w:color="000000"/>
+                <w:left w:val="none" w:sz="0" w:space="0" w:color="000000"/>
+                <w:right w:val="none" w:sz="0" w:space="0" w:color="000000"/>
+              </w:pBdr>
+              <w:spacing w:after="100" w:before="100" w:line="240"/>
+              <w:ind w:left="100" w:right="100" w:firstLine="0" w:firstLineChars="0"/>
+              <w:rPr>
+                <w:rFonts w:ascii="Arial" w:hAnsi="Arial" w:eastAsia="Arial" w:cs="Arial"/>
+                <w:i w:val="false"/>
+                <w:b w:val="false"/>
+                <w:u w:val="none"/>
+                <w:strike w:val="false"/>
+                <w:sz w:val="22"/>
+                <w:szCs w:val="22"/>
+                <w:color w:val="000000"/>
+              </w:rPr>
+            </w:pPr>
+            <w:r>
+              <w:rPr>
+                <w:rFonts w:ascii="Arial" w:hAnsi="Arial" w:eastAsia="Arial" w:cs="Arial"/>
+                <w:i w:val="false"/>
+                <w:b w:val="false"/>
+                <w:u w:val="none"/>
+                <w:strike w:val="false"/>
+                <w:sz w:val="22"/>
+                <w:szCs w:val="22"/>
+                <w:color w:val="000000"/>
+              </w:rPr>
+              <w:t xml:space="preserve">View on Probability</w:t>
+            </w:r>
+          </w:p>
+        </w:tc>
+        <w:tc>
+          <w:tcPr>
+            <w:tcBorders>
+              <w:bottom w:val="single" w:sz="8" w:space="0" w:color="666666"/>
+              <w:top w:val="single" w:sz="8" w:space="0" w:color="666666"/>
+              <w:left w:val="single" w:sz="8" w:space="0" w:color="666666"/>
+              <w:right w:val="single" w:sz="8" w:space="0" w:color="666666"/>
+            </w:tcBorders>
+            <w:shd w:val="clear" w:color="auto" w:fill="FFFFFF"/>
+            <w:tcMar>
+              <w:top w:w="0" w:type="dxa"/>
+              <w:bottom w:w="0" w:type="dxa"/>
+              <w:left w:w="0" w:type="dxa"/>
+              <w:right w:w="0" w:type="dxa"/>
+            </w:tcMar>
+            <w:vAlign w:val="center"/>
+          </w:tcPr>
+          <w:p>
+            <w:pPr>
+              <w:jc w:val="left"/>
+              <w:pBdr>
+                <w:bottom w:val="none" w:sz="0" w:space="0" w:color="000000"/>
+                <w:top w:val="none" w:sz="0" w:space="0" w:color="000000"/>
+                <w:left w:val="none" w:sz="0" w:space="0" w:color="000000"/>
+                <w:right w:val="none" w:sz="0" w:space="0" w:color="000000"/>
+              </w:pBdr>
+              <w:spacing w:after="100" w:before="100" w:line="240"/>
+              <w:ind w:left="100" w:right="100" w:firstLine="0" w:firstLineChars="0"/>
+              <w:rPr>
+                <w:rFonts w:ascii="Arial" w:hAnsi="Arial" w:eastAsia="Arial" w:cs="Arial"/>
+                <w:i w:val="false"/>
+                <w:b w:val="false"/>
+                <w:u w:val="none"/>
+                <w:strike w:val="false"/>
+                <w:sz w:val="22"/>
+                <w:szCs w:val="22"/>
+                <w:color w:val="000000"/>
+              </w:rPr>
+            </w:pPr>
+            <w:r>
+              <w:rPr>
+                <w:rFonts w:ascii="Arial" w:hAnsi="Arial" w:eastAsia="Arial" w:cs="Arial"/>
+                <w:i w:val="false"/>
+                <w:b w:val="false"/>
+                <w:u w:val="none"/>
+                <w:strike w:val="false"/>
+                <w:sz w:val="22"/>
+                <w:szCs w:val="22"/>
+                <w:color w:val="000000"/>
+              </w:rPr>
+              <w:t xml:space="preserve">Objective</w:t>
+            </w:r>
+          </w:p>
+        </w:tc>
+        <w:tc>
+          <w:tcPr>
+            <w:tcBorders>
+              <w:bottom w:val="single" w:sz="8" w:space="0" w:color="666666"/>
+              <w:top w:val="single" w:sz="8" w:space="0" w:color="666666"/>
+              <w:left w:val="single" w:sz="8" w:space="0" w:color="666666"/>
               <w:right w:val="none" w:sz="0" w:space="0" w:color="000000"/>
             </w:tcBorders>
             <w:shd w:val="clear" w:color="auto" w:fill="FFFFFF"/>
@@ -989,7 +1539,7 @@
                 <w:color w:val="000000"/>
               </w:rPr>
             </w:pPr>
-            <w:r xmlns:w="http://schemas.openxmlformats.org/wordprocessingml/2006/main" xmlns:wp="http://schemas.openxmlformats.org/drawingml/2006/wordprocessingDrawing" xmlns:r="http://schemas.openxmlformats.org/officeDocument/2006/relationships" xmlns:w14="http://schemas.microsoft.com/office/word/2010/wordml">
+            <w:r>
               <w:rPr>
                 <w:rFonts w:ascii="Arial" w:hAnsi="Arial" w:eastAsia="Arial" w:cs="Arial"/>
                 <w:i w:val="false"/>
@@ -1000,16 +1550,129 @@
                 <w:szCs w:val="22"/>
                 <w:color w:val="000000"/>
               </w:rPr>
-              <w:t xml:space="preserve">Observed Data</w:t>
+              <w:t xml:space="preserve">Subjective</w:t>
+            </w:r>
+          </w:p>
+        </w:tc>
+      </w:tr>
+      <w:tr>
+        <w:trPr>
+          <w:trHeight w:val="360" w:hRule="auto"/>
+        </w:trPr>
+        <w:tc>
+          <w:tcPr>
+            <w:tcBorders>
+              <w:bottom w:val="single" w:sz="8" w:space="0" w:color="666666"/>
+              <w:top w:val="single" w:sz="8" w:space="0" w:color="666666"/>
+              <w:left w:val="none" w:sz="0" w:space="0" w:color="000000"/>
+              <w:right w:val="single" w:sz="8" w:space="0" w:color="666666"/>
+            </w:tcBorders>
+            <w:shd w:val="clear" w:color="auto" w:fill="FFFFFF"/>
+            <w:tcMar>
+              <w:top w:w="0" w:type="dxa"/>
+              <w:bottom w:w="0" w:type="dxa"/>
+              <w:left w:w="0" w:type="dxa"/>
+              <w:right w:w="0" w:type="dxa"/>
+            </w:tcMar>
+            <w:vAlign w:val="center"/>
+          </w:tcPr>
+          <w:p>
+            <w:pPr>
+              <w:jc w:val="left"/>
+              <w:pBdr>
+                <w:bottom w:val="none" w:sz="0" w:space="0" w:color="000000"/>
+                <w:top w:val="none" w:sz="0" w:space="0" w:color="000000"/>
+                <w:left w:val="none" w:sz="0" w:space="0" w:color="000000"/>
+                <w:right w:val="none" w:sz="0" w:space="0" w:color="000000"/>
+              </w:pBdr>
+              <w:spacing w:after="100" w:before="100" w:line="240"/>
+              <w:ind w:left="100" w:right="100" w:firstLine="0" w:firstLineChars="0"/>
+              <w:rPr>
+                <w:rFonts w:ascii="Arial" w:hAnsi="Arial" w:eastAsia="Arial" w:cs="Arial"/>
+                <w:i w:val="false"/>
+                <w:b w:val="false"/>
+                <w:u w:val="none"/>
+                <w:strike w:val="false"/>
+                <w:sz w:val="22"/>
+                <w:szCs w:val="22"/>
+                <w:color w:val="000000"/>
+              </w:rPr>
+            </w:pPr>
+            <w:r>
+              <w:rPr>
+                <w:rFonts w:ascii="Arial" w:hAnsi="Arial" w:eastAsia="Arial" w:cs="Arial"/>
+                <w:i w:val="false"/>
+                <w:b w:val="false"/>
+                <w:u w:val="none"/>
+                <w:strike w:val="false"/>
+                <w:sz w:val="22"/>
+                <w:szCs w:val="22"/>
+                <w:color w:val="000000"/>
+              </w:rPr>
+              <w:t xml:space="preserve">Computational Burden</w:t>
             </w:r>
           </w:p>
         </w:tc>
         <w:tc>
           <w:tcPr>
             <w:tcBorders>
-              <w:bottom w:val="none" w:sz="0" w:space="0" w:color="000000"/>
-              <w:top w:val="single" w:sz="12" w:space="0" w:color="666666"/>
-              <w:left w:val="none" w:sz="0" w:space="0" w:color="000000"/>
+              <w:bottom w:val="single" w:sz="8" w:space="0" w:color="666666"/>
+              <w:top w:val="single" w:sz="8" w:space="0" w:color="666666"/>
+              <w:left w:val="single" w:sz="8" w:space="0" w:color="666666"/>
+              <w:right w:val="single" w:sz="8" w:space="0" w:color="666666"/>
+            </w:tcBorders>
+            <w:shd w:val="clear" w:color="auto" w:fill="FFFFFF"/>
+            <w:tcMar>
+              <w:top w:w="0" w:type="dxa"/>
+              <w:bottom w:w="0" w:type="dxa"/>
+              <w:left w:w="0" w:type="dxa"/>
+              <w:right w:w="0" w:type="dxa"/>
+            </w:tcMar>
+            <w:vAlign w:val="center"/>
+          </w:tcPr>
+          <w:p>
+            <w:pPr>
+              <w:jc w:val="left"/>
+              <w:pBdr>
+                <w:bottom w:val="none" w:sz="0" w:space="0" w:color="000000"/>
+                <w:top w:val="none" w:sz="0" w:space="0" w:color="000000"/>
+                <w:left w:val="none" w:sz="0" w:space="0" w:color="000000"/>
+                <w:right w:val="none" w:sz="0" w:space="0" w:color="000000"/>
+              </w:pBdr>
+              <w:spacing w:after="100" w:before="100" w:line="240"/>
+              <w:ind w:left="100" w:right="100" w:firstLine="0" w:firstLineChars="0"/>
+              <w:rPr>
+                <w:rFonts w:ascii="Arial" w:hAnsi="Arial" w:eastAsia="Arial" w:cs="Arial"/>
+                <w:i w:val="false"/>
+                <w:b w:val="false"/>
+                <w:u w:val="none"/>
+                <w:strike w:val="false"/>
+                <w:sz w:val="22"/>
+                <w:szCs w:val="22"/>
+                <w:color w:val="000000"/>
+              </w:rPr>
+            </w:pPr>
+            <w:r>
+              <w:rPr>
+                <w:rFonts w:ascii="Arial" w:hAnsi="Arial" w:eastAsia="Arial" w:cs="Arial"/>
+                <w:i w:val="false"/>
+                <w:b w:val="false"/>
+                <w:u w:val="none"/>
+                <w:strike w:val="false"/>
+                <w:sz w:val="22"/>
+                <w:szCs w:val="22"/>
+                <w:color w:val="000000"/>
+              </w:rPr>
+              <w:t xml:space="preserve">Minimal</w:t>
+            </w:r>
+          </w:p>
+        </w:tc>
+        <w:tc>
+          <w:tcPr>
+            <w:tcBorders>
+              <w:bottom w:val="single" w:sz="8" w:space="0" w:color="666666"/>
+              <w:top w:val="single" w:sz="8" w:space="0" w:color="666666"/>
+              <w:left w:val="single" w:sz="8" w:space="0" w:color="666666"/>
               <w:right w:val="none" w:sz="0" w:space="0" w:color="000000"/>
             </w:tcBorders>
             <w:shd w:val="clear" w:color="auto" w:fill="FFFFFF"/>
@@ -1043,7 +1706,7 @@
                 <w:color w:val="000000"/>
               </w:rPr>
             </w:pPr>
-            <w:r xmlns:w="http://schemas.openxmlformats.org/wordprocessingml/2006/main" xmlns:wp="http://schemas.openxmlformats.org/drawingml/2006/wordprocessingDrawing" xmlns:r="http://schemas.openxmlformats.org/officeDocument/2006/relationships" xmlns:w14="http://schemas.microsoft.com/office/word/2010/wordml">
+            <w:r>
               <w:rPr>
                 <w:rFonts w:ascii="Arial" w:hAnsi="Arial" w:eastAsia="Arial" w:cs="Arial"/>
                 <w:i w:val="false"/>
@@ -1054,16 +1717,129 @@
                 <w:szCs w:val="22"/>
                 <w:color w:val="000000"/>
               </w:rPr>
-              <w:t xml:space="preserve">Repeatable and random events</w:t>
+              <w:t xml:space="preserve">Significant</w:t>
+            </w:r>
+          </w:p>
+        </w:tc>
+      </w:tr>
+      <w:tr>
+        <w:trPr>
+          <w:trHeight w:val="360" w:hRule="auto"/>
+        </w:trPr>
+        <w:tc>
+          <w:tcPr>
+            <w:tcBorders>
+              <w:bottom w:val="single" w:sz="12" w:space="0" w:color="666666"/>
+              <w:top w:val="single" w:sz="8" w:space="0" w:color="666666"/>
+              <w:left w:val="none" w:sz="0" w:space="0" w:color="000000"/>
+              <w:right w:val="single" w:sz="8" w:space="0" w:color="666666"/>
+            </w:tcBorders>
+            <w:shd w:val="clear" w:color="auto" w:fill="FFFFFF"/>
+            <w:tcMar>
+              <w:top w:w="0" w:type="dxa"/>
+              <w:bottom w:w="0" w:type="dxa"/>
+              <w:left w:w="0" w:type="dxa"/>
+              <w:right w:w="0" w:type="dxa"/>
+            </w:tcMar>
+            <w:vAlign w:val="center"/>
+          </w:tcPr>
+          <w:p>
+            <w:pPr>
+              <w:jc w:val="left"/>
+              <w:pBdr>
+                <w:bottom w:val="none" w:sz="0" w:space="0" w:color="000000"/>
+                <w:top w:val="none" w:sz="0" w:space="0" w:color="000000"/>
+                <w:left w:val="none" w:sz="0" w:space="0" w:color="000000"/>
+                <w:right w:val="none" w:sz="0" w:space="0" w:color="000000"/>
+              </w:pBdr>
+              <w:spacing w:after="100" w:before="100" w:line="240"/>
+              <w:ind w:left="100" w:right="100" w:firstLine="0" w:firstLineChars="0"/>
+              <w:rPr>
+                <w:rFonts w:ascii="Arial" w:hAnsi="Arial" w:eastAsia="Arial" w:cs="Arial"/>
+                <w:i w:val="false"/>
+                <w:b w:val="false"/>
+                <w:u w:val="none"/>
+                <w:strike w:val="false"/>
+                <w:sz w:val="22"/>
+                <w:szCs w:val="22"/>
+                <w:color w:val="000000"/>
+              </w:rPr>
+            </w:pPr>
+            <w:r>
+              <w:rPr>
+                <w:rFonts w:ascii="Arial" w:hAnsi="Arial" w:eastAsia="Arial" w:cs="Arial"/>
+                <w:i w:val="false"/>
+                <w:b w:val="false"/>
+                <w:u w:val="none"/>
+                <w:strike w:val="false"/>
+                <w:sz w:val="22"/>
+                <w:szCs w:val="22"/>
+                <w:color w:val="000000"/>
+              </w:rPr>
+              <w:t xml:space="preserve">End Result</w:t>
             </w:r>
           </w:p>
         </w:tc>
         <w:tc>
           <w:tcPr>
             <w:tcBorders>
-              <w:bottom w:val="none" w:sz="0" w:space="0" w:color="000000"/>
-              <w:top w:val="single" w:sz="12" w:space="0" w:color="666666"/>
-              <w:left w:val="none" w:sz="0" w:space="0" w:color="000000"/>
+              <w:bottom w:val="single" w:sz="12" w:space="0" w:color="666666"/>
+              <w:top w:val="single" w:sz="8" w:space="0" w:color="666666"/>
+              <w:left w:val="single" w:sz="8" w:space="0" w:color="666666"/>
+              <w:right w:val="single" w:sz="8" w:space="0" w:color="666666"/>
+            </w:tcBorders>
+            <w:shd w:val="clear" w:color="auto" w:fill="FFFFFF"/>
+            <w:tcMar>
+              <w:top w:w="0" w:type="dxa"/>
+              <w:bottom w:w="0" w:type="dxa"/>
+              <w:left w:w="0" w:type="dxa"/>
+              <w:right w:w="0" w:type="dxa"/>
+            </w:tcMar>
+            <w:vAlign w:val="center"/>
+          </w:tcPr>
+          <w:p>
+            <w:pPr>
+              <w:jc w:val="left"/>
+              <w:pBdr>
+                <w:bottom w:val="none" w:sz="0" w:space="0" w:color="000000"/>
+                <w:top w:val="none" w:sz="0" w:space="0" w:color="000000"/>
+                <w:left w:val="none" w:sz="0" w:space="0" w:color="000000"/>
+                <w:right w:val="none" w:sz="0" w:space="0" w:color="000000"/>
+              </w:pBdr>
+              <w:spacing w:after="100" w:before="100" w:line="240"/>
+              <w:ind w:left="100" w:right="100" w:firstLine="0" w:firstLineChars="0"/>
+              <w:rPr>
+                <w:rFonts w:ascii="Arial" w:hAnsi="Arial" w:eastAsia="Arial" w:cs="Arial"/>
+                <w:i w:val="false"/>
+                <w:b w:val="false"/>
+                <w:u w:val="none"/>
+                <w:strike w:val="false"/>
+                <w:sz w:val="22"/>
+                <w:szCs w:val="22"/>
+                <w:color w:val="000000"/>
+              </w:rPr>
+            </w:pPr>
+            <w:r>
+              <w:rPr>
+                <w:rFonts w:ascii="Arial" w:hAnsi="Arial" w:eastAsia="Arial" w:cs="Arial"/>
+                <w:i w:val="false"/>
+                <w:b w:val="false"/>
+                <w:u w:val="none"/>
+                <w:strike w:val="false"/>
+                <w:sz w:val="22"/>
+                <w:szCs w:val="22"/>
+                <w:color w:val="000000"/>
+              </w:rPr>
+              <w:t xml:space="preserve">The probability of observing a set of events is based on a distribution and a set of defined parameters</w:t>
+            </w:r>
+          </w:p>
+        </w:tc>
+        <w:tc>
+          <w:tcPr>
+            <w:tcBorders>
+              <w:bottom w:val="single" w:sz="12" w:space="0" w:color="666666"/>
+              <w:top w:val="single" w:sz="8" w:space="0" w:color="666666"/>
+              <w:left w:val="single" w:sz="8" w:space="0" w:color="666666"/>
               <w:right w:val="none" w:sz="0" w:space="0" w:color="000000"/>
             </w:tcBorders>
             <w:shd w:val="clear" w:color="auto" w:fill="FFFFFF"/>
@@ -1097,675 +1873,7 @@
                 <w:color w:val="000000"/>
               </w:rPr>
             </w:pPr>
-            <w:r xmlns:w="http://schemas.openxmlformats.org/wordprocessingml/2006/main" xmlns:wp="http://schemas.openxmlformats.org/drawingml/2006/wordprocessingDrawing" xmlns:r="http://schemas.openxmlformats.org/officeDocument/2006/relationships" xmlns:w14="http://schemas.microsoft.com/office/word/2010/wordml">
-              <w:rPr>
-                <w:rFonts w:ascii="Arial" w:hAnsi="Arial" w:eastAsia="Arial" w:cs="Arial"/>
-                <w:i w:val="false"/>
-                <w:b w:val="false"/>
-                <w:u w:val="none"/>
-                <w:strike w:val="false"/>
-                <w:sz w:val="22"/>
-                <w:szCs w:val="22"/>
-                <w:color w:val="000000"/>
-              </w:rPr>
-              <w:t xml:space="preserve">Known and fixed sample</w:t>
-            </w:r>
-          </w:p>
-        </w:tc>
-      </w:tr>
-      <w:tr>
-        <w:trPr>
-          <w:trHeight w:val="360" w:hRule="auto"/>
-        </w:trPr>
-        <w:tc>
-          <w:tcPr>
-            <w:tcBorders>
-              <w:bottom w:val="none" w:sz="0" w:space="0" w:color="000000"/>
-              <w:top w:val="none" w:sz="0" w:space="0" w:color="000000"/>
-              <w:left w:val="none" w:sz="0" w:space="0" w:color="000000"/>
-              <w:right w:val="none" w:sz="0" w:space="0" w:color="000000"/>
-            </w:tcBorders>
-            <w:shd w:val="clear" w:color="auto" w:fill="FFFFFF"/>
-            <w:tcMar>
-              <w:top w:w="0" w:type="dxa"/>
-              <w:bottom w:w="0" w:type="dxa"/>
-              <w:left w:w="0" w:type="dxa"/>
-              <w:right w:w="0" w:type="dxa"/>
-            </w:tcMar>
-            <w:vAlign w:val="center"/>
-          </w:tcPr>
-          <w:p>
-            <w:pPr>
-              <w:jc w:val="left"/>
-              <w:pBdr>
-                <w:bottom w:val="none" w:sz="0" w:space="0" w:color="000000"/>
-                <w:top w:val="none" w:sz="0" w:space="0" w:color="000000"/>
-                <w:left w:val="none" w:sz="0" w:space="0" w:color="000000"/>
-                <w:right w:val="none" w:sz="0" w:space="0" w:color="000000"/>
-              </w:pBdr>
-              <w:spacing w:after="100" w:before="100" w:line="240"/>
-              <w:ind w:left="100" w:right="100" w:firstLine="0" w:firstLineChars="0"/>
-              <w:rPr>
-                <w:rFonts w:ascii="Arial" w:hAnsi="Arial" w:eastAsia="Arial" w:cs="Arial"/>
-                <w:i w:val="false"/>
-                <w:b w:val="false"/>
-                <w:u w:val="none"/>
-                <w:strike w:val="false"/>
-                <w:sz w:val="22"/>
-                <w:szCs w:val="22"/>
-                <w:color w:val="000000"/>
-              </w:rPr>
-            </w:pPr>
-            <w:r xmlns:w="http://schemas.openxmlformats.org/wordprocessingml/2006/main" xmlns:wp="http://schemas.openxmlformats.org/drawingml/2006/wordprocessingDrawing" xmlns:r="http://schemas.openxmlformats.org/officeDocument/2006/relationships" xmlns:w14="http://schemas.microsoft.com/office/word/2010/wordml">
-              <w:rPr>
-                <w:rFonts w:ascii="Arial" w:hAnsi="Arial" w:eastAsia="Arial" w:cs="Arial"/>
-                <w:i w:val="false"/>
-                <w:b w:val="false"/>
-                <w:u w:val="none"/>
-                <w:strike w:val="false"/>
-                <w:sz w:val="22"/>
-                <w:szCs w:val="22"/>
-                <w:color w:val="000000"/>
-              </w:rPr>
-              <w:t xml:space="preserve">Parameters</w:t>
-            </w:r>
-          </w:p>
-        </w:tc>
-        <w:tc>
-          <w:tcPr>
-            <w:tcBorders>
-              <w:bottom w:val="none" w:sz="0" w:space="0" w:color="000000"/>
-              <w:top w:val="none" w:sz="0" w:space="0" w:color="000000"/>
-              <w:left w:val="none" w:sz="0" w:space="0" w:color="000000"/>
-              <w:right w:val="none" w:sz="0" w:space="0" w:color="000000"/>
-            </w:tcBorders>
-            <w:shd w:val="clear" w:color="auto" w:fill="FFFFFF"/>
-            <w:tcMar>
-              <w:top w:w="0" w:type="dxa"/>
-              <w:bottom w:w="0" w:type="dxa"/>
-              <w:left w:w="0" w:type="dxa"/>
-              <w:right w:w="0" w:type="dxa"/>
-            </w:tcMar>
-            <w:vAlign w:val="center"/>
-          </w:tcPr>
-          <w:p>
-            <w:pPr>
-              <w:jc w:val="left"/>
-              <w:pBdr>
-                <w:bottom w:val="none" w:sz="0" w:space="0" w:color="000000"/>
-                <w:top w:val="none" w:sz="0" w:space="0" w:color="000000"/>
-                <w:left w:val="none" w:sz="0" w:space="0" w:color="000000"/>
-                <w:right w:val="none" w:sz="0" w:space="0" w:color="000000"/>
-              </w:pBdr>
-              <w:spacing w:after="100" w:before="100" w:line="240"/>
-              <w:ind w:left="100" w:right="100" w:firstLine="0" w:firstLineChars="0"/>
-              <w:rPr>
-                <w:rFonts w:ascii="Arial" w:hAnsi="Arial" w:eastAsia="Arial" w:cs="Arial"/>
-                <w:i w:val="false"/>
-                <w:b w:val="false"/>
-                <w:u w:val="none"/>
-                <w:strike w:val="false"/>
-                <w:sz w:val="22"/>
-                <w:szCs w:val="22"/>
-                <w:color w:val="000000"/>
-              </w:rPr>
-            </w:pPr>
-            <w:r xmlns:w="http://schemas.openxmlformats.org/wordprocessingml/2006/main" xmlns:wp="http://schemas.openxmlformats.org/drawingml/2006/wordprocessingDrawing" xmlns:r="http://schemas.openxmlformats.org/officeDocument/2006/relationships" xmlns:w14="http://schemas.microsoft.com/office/word/2010/wordml">
-              <w:rPr>
-                <w:rFonts w:ascii="Arial" w:hAnsi="Arial" w:eastAsia="Arial" w:cs="Arial"/>
-                <w:i w:val="false"/>
-                <w:b w:val="false"/>
-                <w:u w:val="none"/>
-                <w:strike w:val="false"/>
-                <w:sz w:val="22"/>
-                <w:szCs w:val="22"/>
-                <w:color w:val="000000"/>
-              </w:rPr>
-              <w:t xml:space="preserve">Fixed values</w:t>
-            </w:r>
-          </w:p>
-        </w:tc>
-        <w:tc>
-          <w:tcPr>
-            <w:tcBorders>
-              <w:bottom w:val="none" w:sz="0" w:space="0" w:color="000000"/>
-              <w:top w:val="none" w:sz="0" w:space="0" w:color="000000"/>
-              <w:left w:val="none" w:sz="0" w:space="0" w:color="000000"/>
-              <w:right w:val="none" w:sz="0" w:space="0" w:color="000000"/>
-            </w:tcBorders>
-            <w:shd w:val="clear" w:color="auto" w:fill="FFFFFF"/>
-            <w:tcMar>
-              <w:top w:w="0" w:type="dxa"/>
-              <w:bottom w:w="0" w:type="dxa"/>
-              <w:left w:w="0" w:type="dxa"/>
-              <w:right w:w="0" w:type="dxa"/>
-            </w:tcMar>
-            <w:vAlign w:val="center"/>
-          </w:tcPr>
-          <w:p>
-            <w:pPr>
-              <w:jc w:val="left"/>
-              <w:pBdr>
-                <w:bottom w:val="none" w:sz="0" w:space="0" w:color="000000"/>
-                <w:top w:val="none" w:sz="0" w:space="0" w:color="000000"/>
-                <w:left w:val="none" w:sz="0" w:space="0" w:color="000000"/>
-                <w:right w:val="none" w:sz="0" w:space="0" w:color="000000"/>
-              </w:pBdr>
-              <w:spacing w:after="100" w:before="100" w:line="240"/>
-              <w:ind w:left="100" w:right="100" w:firstLine="0" w:firstLineChars="0"/>
-              <w:rPr>
-                <w:rFonts w:ascii="Arial" w:hAnsi="Arial" w:eastAsia="Arial" w:cs="Arial"/>
-                <w:i w:val="false"/>
-                <w:b w:val="false"/>
-                <w:u w:val="none"/>
-                <w:strike w:val="false"/>
-                <w:sz w:val="22"/>
-                <w:szCs w:val="22"/>
-                <w:color w:val="000000"/>
-              </w:rPr>
-            </w:pPr>
-            <w:r xmlns:w="http://schemas.openxmlformats.org/wordprocessingml/2006/main" xmlns:wp="http://schemas.openxmlformats.org/drawingml/2006/wordprocessingDrawing" xmlns:r="http://schemas.openxmlformats.org/officeDocument/2006/relationships" xmlns:w14="http://schemas.microsoft.com/office/word/2010/wordml">
-              <w:rPr>
-                <w:rFonts w:ascii="Arial" w:hAnsi="Arial" w:eastAsia="Arial" w:cs="Arial"/>
-                <w:i w:val="false"/>
-                <w:b w:val="false"/>
-                <w:u w:val="none"/>
-                <w:strike w:val="false"/>
-                <w:sz w:val="22"/>
-                <w:szCs w:val="22"/>
-                <w:color w:val="000000"/>
-              </w:rPr>
-              <w:t xml:space="preserve">Unknown</w:t>
-            </w:r>
-          </w:p>
-        </w:tc>
-      </w:tr>
-      <w:tr>
-        <w:trPr>
-          <w:trHeight w:val="360" w:hRule="auto"/>
-        </w:trPr>
-        <w:tc>
-          <w:tcPr>
-            <w:tcBorders>
-              <w:bottom w:val="none" w:sz="0" w:space="0" w:color="000000"/>
-              <w:top w:val="none" w:sz="0" w:space="0" w:color="000000"/>
-              <w:left w:val="none" w:sz="0" w:space="0" w:color="000000"/>
-              <w:right w:val="none" w:sz="0" w:space="0" w:color="000000"/>
-            </w:tcBorders>
-            <w:shd w:val="clear" w:color="auto" w:fill="FFFFFF"/>
-            <w:tcMar>
-              <w:top w:w="0" w:type="dxa"/>
-              <w:bottom w:w="0" w:type="dxa"/>
-              <w:left w:w="0" w:type="dxa"/>
-              <w:right w:w="0" w:type="dxa"/>
-            </w:tcMar>
-            <w:vAlign w:val="center"/>
-          </w:tcPr>
-          <w:p>
-            <w:pPr>
-              <w:jc w:val="left"/>
-              <w:pBdr>
-                <w:bottom w:val="none" w:sz="0" w:space="0" w:color="000000"/>
-                <w:top w:val="none" w:sz="0" w:space="0" w:color="000000"/>
-                <w:left w:val="none" w:sz="0" w:space="0" w:color="000000"/>
-                <w:right w:val="none" w:sz="0" w:space="0" w:color="000000"/>
-              </w:pBdr>
-              <w:spacing w:after="100" w:before="100" w:line="240"/>
-              <w:ind w:left="100" w:right="100" w:firstLine="0" w:firstLineChars="0"/>
-              <w:rPr>
-                <w:rFonts w:ascii="Arial" w:hAnsi="Arial" w:eastAsia="Arial" w:cs="Arial"/>
-                <w:i w:val="false"/>
-                <w:b w:val="false"/>
-                <w:u w:val="none"/>
-                <w:strike w:val="false"/>
-                <w:sz w:val="22"/>
-                <w:szCs w:val="22"/>
-                <w:color w:val="000000"/>
-              </w:rPr>
-            </w:pPr>
-            <w:r xmlns:w="http://schemas.openxmlformats.org/wordprocessingml/2006/main" xmlns:wp="http://schemas.openxmlformats.org/drawingml/2006/wordprocessingDrawing" xmlns:r="http://schemas.openxmlformats.org/officeDocument/2006/relationships" xmlns:w14="http://schemas.microsoft.com/office/word/2010/wordml">
-              <w:rPr>
-                <w:rFonts w:ascii="Arial" w:hAnsi="Arial" w:eastAsia="Arial" w:cs="Arial"/>
-                <w:i w:val="false"/>
-                <w:b w:val="false"/>
-                <w:u w:val="none"/>
-                <w:strike w:val="false"/>
-                <w:sz w:val="22"/>
-                <w:szCs w:val="22"/>
-                <w:color w:val="000000"/>
-              </w:rPr>
-              <w:t xml:space="preserve">View on Probability</w:t>
-            </w:r>
-          </w:p>
-        </w:tc>
-        <w:tc>
-          <w:tcPr>
-            <w:tcBorders>
-              <w:bottom w:val="none" w:sz="0" w:space="0" w:color="000000"/>
-              <w:top w:val="none" w:sz="0" w:space="0" w:color="000000"/>
-              <w:left w:val="none" w:sz="0" w:space="0" w:color="000000"/>
-              <w:right w:val="none" w:sz="0" w:space="0" w:color="000000"/>
-            </w:tcBorders>
-            <w:shd w:val="clear" w:color="auto" w:fill="FFFFFF"/>
-            <w:tcMar>
-              <w:top w:w="0" w:type="dxa"/>
-              <w:bottom w:w="0" w:type="dxa"/>
-              <w:left w:w="0" w:type="dxa"/>
-              <w:right w:w="0" w:type="dxa"/>
-            </w:tcMar>
-            <w:vAlign w:val="center"/>
-          </w:tcPr>
-          <w:p>
-            <w:pPr>
-              <w:jc w:val="left"/>
-              <w:pBdr>
-                <w:bottom w:val="none" w:sz="0" w:space="0" w:color="000000"/>
-                <w:top w:val="none" w:sz="0" w:space="0" w:color="000000"/>
-                <w:left w:val="none" w:sz="0" w:space="0" w:color="000000"/>
-                <w:right w:val="none" w:sz="0" w:space="0" w:color="000000"/>
-              </w:pBdr>
-              <w:spacing w:after="100" w:before="100" w:line="240"/>
-              <w:ind w:left="100" w:right="100" w:firstLine="0" w:firstLineChars="0"/>
-              <w:rPr>
-                <w:rFonts w:ascii="Arial" w:hAnsi="Arial" w:eastAsia="Arial" w:cs="Arial"/>
-                <w:i w:val="false"/>
-                <w:b w:val="false"/>
-                <w:u w:val="none"/>
-                <w:strike w:val="false"/>
-                <w:sz w:val="22"/>
-                <w:szCs w:val="22"/>
-                <w:color w:val="000000"/>
-              </w:rPr>
-            </w:pPr>
-            <w:r xmlns:w="http://schemas.openxmlformats.org/wordprocessingml/2006/main" xmlns:wp="http://schemas.openxmlformats.org/drawingml/2006/wordprocessingDrawing" xmlns:r="http://schemas.openxmlformats.org/officeDocument/2006/relationships" xmlns:w14="http://schemas.microsoft.com/office/word/2010/wordml">
-              <w:rPr>
-                <w:rFonts w:ascii="Arial" w:hAnsi="Arial" w:eastAsia="Arial" w:cs="Arial"/>
-                <w:i w:val="false"/>
-                <w:b w:val="false"/>
-                <w:u w:val="none"/>
-                <w:strike w:val="false"/>
-                <w:sz w:val="22"/>
-                <w:szCs w:val="22"/>
-                <w:color w:val="000000"/>
-              </w:rPr>
-              <w:t xml:space="preserve">Objective</w:t>
-            </w:r>
-          </w:p>
-        </w:tc>
-        <w:tc>
-          <w:tcPr>
-            <w:tcBorders>
-              <w:bottom w:val="none" w:sz="0" w:space="0" w:color="000000"/>
-              <w:top w:val="none" w:sz="0" w:space="0" w:color="000000"/>
-              <w:left w:val="none" w:sz="0" w:space="0" w:color="000000"/>
-              <w:right w:val="none" w:sz="0" w:space="0" w:color="000000"/>
-            </w:tcBorders>
-            <w:shd w:val="clear" w:color="auto" w:fill="FFFFFF"/>
-            <w:tcMar>
-              <w:top w:w="0" w:type="dxa"/>
-              <w:bottom w:w="0" w:type="dxa"/>
-              <w:left w:w="0" w:type="dxa"/>
-              <w:right w:w="0" w:type="dxa"/>
-            </w:tcMar>
-            <w:vAlign w:val="center"/>
-          </w:tcPr>
-          <w:p>
-            <w:pPr>
-              <w:jc w:val="left"/>
-              <w:pBdr>
-                <w:bottom w:val="none" w:sz="0" w:space="0" w:color="000000"/>
-                <w:top w:val="none" w:sz="0" w:space="0" w:color="000000"/>
-                <w:left w:val="none" w:sz="0" w:space="0" w:color="000000"/>
-                <w:right w:val="none" w:sz="0" w:space="0" w:color="000000"/>
-              </w:pBdr>
-              <w:spacing w:after="100" w:before="100" w:line="240"/>
-              <w:ind w:left="100" w:right="100" w:firstLine="0" w:firstLineChars="0"/>
-              <w:rPr>
-                <w:rFonts w:ascii="Arial" w:hAnsi="Arial" w:eastAsia="Arial" w:cs="Arial"/>
-                <w:i w:val="false"/>
-                <w:b w:val="false"/>
-                <w:u w:val="none"/>
-                <w:strike w:val="false"/>
-                <w:sz w:val="22"/>
-                <w:szCs w:val="22"/>
-                <w:color w:val="000000"/>
-              </w:rPr>
-            </w:pPr>
-            <w:r xmlns:w="http://schemas.openxmlformats.org/wordprocessingml/2006/main" xmlns:wp="http://schemas.openxmlformats.org/drawingml/2006/wordprocessingDrawing" xmlns:r="http://schemas.openxmlformats.org/officeDocument/2006/relationships" xmlns:w14="http://schemas.microsoft.com/office/word/2010/wordml">
-              <w:rPr>
-                <w:rFonts w:ascii="Arial" w:hAnsi="Arial" w:eastAsia="Arial" w:cs="Arial"/>
-                <w:i w:val="false"/>
-                <w:b w:val="false"/>
-                <w:u w:val="none"/>
-                <w:strike w:val="false"/>
-                <w:sz w:val="22"/>
-                <w:szCs w:val="22"/>
-                <w:color w:val="000000"/>
-              </w:rPr>
-              <w:t xml:space="preserve">Subjective</w:t>
-            </w:r>
-          </w:p>
-        </w:tc>
-      </w:tr>
-      <w:tr>
-        <w:trPr>
-          <w:trHeight w:val="360" w:hRule="auto"/>
-        </w:trPr>
-        <w:tc>
-          <w:tcPr>
-            <w:tcBorders>
-              <w:bottom w:val="none" w:sz="0" w:space="0" w:color="000000"/>
-              <w:top w:val="none" w:sz="0" w:space="0" w:color="000000"/>
-              <w:left w:val="none" w:sz="0" w:space="0" w:color="000000"/>
-              <w:right w:val="none" w:sz="0" w:space="0" w:color="000000"/>
-            </w:tcBorders>
-            <w:shd w:val="clear" w:color="auto" w:fill="FFFFFF"/>
-            <w:tcMar>
-              <w:top w:w="0" w:type="dxa"/>
-              <w:bottom w:w="0" w:type="dxa"/>
-              <w:left w:w="0" w:type="dxa"/>
-              <w:right w:w="0" w:type="dxa"/>
-            </w:tcMar>
-            <w:vAlign w:val="center"/>
-          </w:tcPr>
-          <w:p>
-            <w:pPr>
-              <w:jc w:val="left"/>
-              <w:pBdr>
-                <w:bottom w:val="none" w:sz="0" w:space="0" w:color="000000"/>
-                <w:top w:val="none" w:sz="0" w:space="0" w:color="000000"/>
-                <w:left w:val="none" w:sz="0" w:space="0" w:color="000000"/>
-                <w:right w:val="none" w:sz="0" w:space="0" w:color="000000"/>
-              </w:pBdr>
-              <w:spacing w:after="100" w:before="100" w:line="240"/>
-              <w:ind w:left="100" w:right="100" w:firstLine="0" w:firstLineChars="0"/>
-              <w:rPr>
-                <w:rFonts w:ascii="Arial" w:hAnsi="Arial" w:eastAsia="Arial" w:cs="Arial"/>
-                <w:i w:val="false"/>
-                <w:b w:val="false"/>
-                <w:u w:val="none"/>
-                <w:strike w:val="false"/>
-                <w:sz w:val="22"/>
-                <w:szCs w:val="22"/>
-                <w:color w:val="000000"/>
-              </w:rPr>
-            </w:pPr>
-            <w:r xmlns:w="http://schemas.openxmlformats.org/wordprocessingml/2006/main" xmlns:wp="http://schemas.openxmlformats.org/drawingml/2006/wordprocessingDrawing" xmlns:r="http://schemas.openxmlformats.org/officeDocument/2006/relationships" xmlns:w14="http://schemas.microsoft.com/office/word/2010/wordml">
-              <w:rPr>
-                <w:rFonts w:ascii="Arial" w:hAnsi="Arial" w:eastAsia="Arial" w:cs="Arial"/>
-                <w:i w:val="false"/>
-                <w:b w:val="false"/>
-                <w:u w:val="none"/>
-                <w:strike w:val="false"/>
-                <w:sz w:val="22"/>
-                <w:szCs w:val="22"/>
-                <w:color w:val="000000"/>
-              </w:rPr>
-              <w:t xml:space="preserve">Computational Burden</w:t>
-            </w:r>
-          </w:p>
-        </w:tc>
-        <w:tc>
-          <w:tcPr>
-            <w:tcBorders>
-              <w:bottom w:val="none" w:sz="0" w:space="0" w:color="000000"/>
-              <w:top w:val="none" w:sz="0" w:space="0" w:color="000000"/>
-              <w:left w:val="none" w:sz="0" w:space="0" w:color="000000"/>
-              <w:right w:val="none" w:sz="0" w:space="0" w:color="000000"/>
-            </w:tcBorders>
-            <w:shd w:val="clear" w:color="auto" w:fill="FFFFFF"/>
-            <w:tcMar>
-              <w:top w:w="0" w:type="dxa"/>
-              <w:bottom w:w="0" w:type="dxa"/>
-              <w:left w:w="0" w:type="dxa"/>
-              <w:right w:w="0" w:type="dxa"/>
-            </w:tcMar>
-            <w:vAlign w:val="center"/>
-          </w:tcPr>
-          <w:p>
-            <w:pPr>
-              <w:jc w:val="left"/>
-              <w:pBdr>
-                <w:bottom w:val="none" w:sz="0" w:space="0" w:color="000000"/>
-                <w:top w:val="none" w:sz="0" w:space="0" w:color="000000"/>
-                <w:left w:val="none" w:sz="0" w:space="0" w:color="000000"/>
-                <w:right w:val="none" w:sz="0" w:space="0" w:color="000000"/>
-              </w:pBdr>
-              <w:spacing w:after="100" w:before="100" w:line="240"/>
-              <w:ind w:left="100" w:right="100" w:firstLine="0" w:firstLineChars="0"/>
-              <w:rPr>
-                <w:rFonts w:ascii="Arial" w:hAnsi="Arial" w:eastAsia="Arial" w:cs="Arial"/>
-                <w:i w:val="false"/>
-                <w:b w:val="false"/>
-                <w:u w:val="none"/>
-                <w:strike w:val="false"/>
-                <w:sz w:val="22"/>
-                <w:szCs w:val="22"/>
-                <w:color w:val="000000"/>
-              </w:rPr>
-            </w:pPr>
-            <w:r xmlns:w="http://schemas.openxmlformats.org/wordprocessingml/2006/main" xmlns:wp="http://schemas.openxmlformats.org/drawingml/2006/wordprocessingDrawing" xmlns:r="http://schemas.openxmlformats.org/officeDocument/2006/relationships" xmlns:w14="http://schemas.microsoft.com/office/word/2010/wordml">
-              <w:rPr>
-                <w:rFonts w:ascii="Arial" w:hAnsi="Arial" w:eastAsia="Arial" w:cs="Arial"/>
-                <w:i w:val="false"/>
-                <w:b w:val="false"/>
-                <w:u w:val="none"/>
-                <w:strike w:val="false"/>
-                <w:sz w:val="22"/>
-                <w:szCs w:val="22"/>
-                <w:color w:val="000000"/>
-              </w:rPr>
-              <w:t xml:space="preserve">Minimal</w:t>
-            </w:r>
-          </w:p>
-        </w:tc>
-        <w:tc>
-          <w:tcPr>
-            <w:tcBorders>
-              <w:bottom w:val="none" w:sz="0" w:space="0" w:color="000000"/>
-              <w:top w:val="none" w:sz="0" w:space="0" w:color="000000"/>
-              <w:left w:val="none" w:sz="0" w:space="0" w:color="000000"/>
-              <w:right w:val="none" w:sz="0" w:space="0" w:color="000000"/>
-            </w:tcBorders>
-            <w:shd w:val="clear" w:color="auto" w:fill="FFFFFF"/>
-            <w:tcMar>
-              <w:top w:w="0" w:type="dxa"/>
-              <w:bottom w:w="0" w:type="dxa"/>
-              <w:left w:w="0" w:type="dxa"/>
-              <w:right w:w="0" w:type="dxa"/>
-            </w:tcMar>
-            <w:vAlign w:val="center"/>
-          </w:tcPr>
-          <w:p>
-            <w:pPr>
-              <w:jc w:val="left"/>
-              <w:pBdr>
-                <w:bottom w:val="none" w:sz="0" w:space="0" w:color="000000"/>
-                <w:top w:val="none" w:sz="0" w:space="0" w:color="000000"/>
-                <w:left w:val="none" w:sz="0" w:space="0" w:color="000000"/>
-                <w:right w:val="none" w:sz="0" w:space="0" w:color="000000"/>
-              </w:pBdr>
-              <w:spacing w:after="100" w:before="100" w:line="240"/>
-              <w:ind w:left="100" w:right="100" w:firstLine="0" w:firstLineChars="0"/>
-              <w:rPr>
-                <w:rFonts w:ascii="Arial" w:hAnsi="Arial" w:eastAsia="Arial" w:cs="Arial"/>
-                <w:i w:val="false"/>
-                <w:b w:val="false"/>
-                <w:u w:val="none"/>
-                <w:strike w:val="false"/>
-                <w:sz w:val="22"/>
-                <w:szCs w:val="22"/>
-                <w:color w:val="000000"/>
-              </w:rPr>
-            </w:pPr>
-            <w:r xmlns:w="http://schemas.openxmlformats.org/wordprocessingml/2006/main" xmlns:wp="http://schemas.openxmlformats.org/drawingml/2006/wordprocessingDrawing" xmlns:r="http://schemas.openxmlformats.org/officeDocument/2006/relationships" xmlns:w14="http://schemas.microsoft.com/office/word/2010/wordml">
-              <w:rPr>
-                <w:rFonts w:ascii="Arial" w:hAnsi="Arial" w:eastAsia="Arial" w:cs="Arial"/>
-                <w:i w:val="false"/>
-                <w:b w:val="false"/>
-                <w:u w:val="none"/>
-                <w:strike w:val="false"/>
-                <w:sz w:val="22"/>
-                <w:szCs w:val="22"/>
-                <w:color w:val="000000"/>
-              </w:rPr>
-              <w:t xml:space="preserve">Significant</w:t>
-            </w:r>
-          </w:p>
-        </w:tc>
-      </w:tr>
-      <w:tr>
-        <w:trPr>
-          <w:trHeight w:val="360" w:hRule="auto"/>
-        </w:trPr>
-        <w:tc>
-          <w:tcPr>
-            <w:tcBorders>
-              <w:bottom w:val="single" w:sz="12" w:space="0" w:color="666666"/>
-              <w:top w:val="none" w:sz="0" w:space="0" w:color="000000"/>
-              <w:left w:val="none" w:sz="0" w:space="0" w:color="000000"/>
-              <w:right w:val="none" w:sz="0" w:space="0" w:color="000000"/>
-            </w:tcBorders>
-            <w:shd w:val="clear" w:color="auto" w:fill="FFFFFF"/>
-            <w:tcMar>
-              <w:top w:w="0" w:type="dxa"/>
-              <w:bottom w:w="0" w:type="dxa"/>
-              <w:left w:w="0" w:type="dxa"/>
-              <w:right w:w="0" w:type="dxa"/>
-            </w:tcMar>
-            <w:vAlign w:val="center"/>
-          </w:tcPr>
-          <w:p>
-            <w:pPr>
-              <w:jc w:val="left"/>
-              <w:pBdr>
-                <w:bottom w:val="none" w:sz="0" w:space="0" w:color="000000"/>
-                <w:top w:val="none" w:sz="0" w:space="0" w:color="000000"/>
-                <w:left w:val="none" w:sz="0" w:space="0" w:color="000000"/>
-                <w:right w:val="none" w:sz="0" w:space="0" w:color="000000"/>
-              </w:pBdr>
-              <w:spacing w:after="100" w:before="100" w:line="240"/>
-              <w:ind w:left="100" w:right="100" w:firstLine="0" w:firstLineChars="0"/>
-              <w:rPr>
-                <w:rFonts w:ascii="Arial" w:hAnsi="Arial" w:eastAsia="Arial" w:cs="Arial"/>
-                <w:i w:val="false"/>
-                <w:b w:val="false"/>
-                <w:u w:val="none"/>
-                <w:strike w:val="false"/>
-                <w:sz w:val="22"/>
-                <w:szCs w:val="22"/>
-                <w:color w:val="000000"/>
-              </w:rPr>
-            </w:pPr>
-            <w:r xmlns:w="http://schemas.openxmlformats.org/wordprocessingml/2006/main" xmlns:wp="http://schemas.openxmlformats.org/drawingml/2006/wordprocessingDrawing" xmlns:r="http://schemas.openxmlformats.org/officeDocument/2006/relationships" xmlns:w14="http://schemas.microsoft.com/office/word/2010/wordml">
-              <w:rPr>
-                <w:rFonts w:ascii="Arial" w:hAnsi="Arial" w:eastAsia="Arial" w:cs="Arial"/>
-                <w:i w:val="false"/>
-                <w:b w:val="false"/>
-                <w:u w:val="none"/>
-                <w:strike w:val="false"/>
-                <w:sz w:val="22"/>
-                <w:szCs w:val="22"/>
-                <w:color w:val="000000"/>
-              </w:rPr>
-              <w:t xml:space="preserve">End Result</w:t>
-            </w:r>
-          </w:p>
-        </w:tc>
-        <w:tc>
-          <w:tcPr>
-            <w:tcBorders>
-              <w:bottom w:val="single" w:sz="12" w:space="0" w:color="666666"/>
-              <w:top w:val="none" w:sz="0" w:space="0" w:color="000000"/>
-              <w:left w:val="none" w:sz="0" w:space="0" w:color="000000"/>
-              <w:right w:val="none" w:sz="0" w:space="0" w:color="000000"/>
-            </w:tcBorders>
-            <w:shd w:val="clear" w:color="auto" w:fill="FFFFFF"/>
-            <w:tcMar>
-              <w:top w:w="0" w:type="dxa"/>
-              <w:bottom w:w="0" w:type="dxa"/>
-              <w:left w:w="0" w:type="dxa"/>
-              <w:right w:w="0" w:type="dxa"/>
-            </w:tcMar>
-            <w:vAlign w:val="center"/>
-          </w:tcPr>
-          <w:p>
-            <w:pPr>
-              <w:jc w:val="left"/>
-              <w:pBdr>
-                <w:bottom w:val="none" w:sz="0" w:space="0" w:color="000000"/>
-                <w:top w:val="none" w:sz="0" w:space="0" w:color="000000"/>
-                <w:left w:val="none" w:sz="0" w:space="0" w:color="000000"/>
-                <w:right w:val="none" w:sz="0" w:space="0" w:color="000000"/>
-              </w:pBdr>
-              <w:spacing w:after="100" w:before="100" w:line="240"/>
-              <w:ind w:left="100" w:right="100" w:firstLine="0" w:firstLineChars="0"/>
-              <w:rPr>
-                <w:rFonts w:ascii="Arial" w:hAnsi="Arial" w:eastAsia="Arial" w:cs="Arial"/>
-                <w:i w:val="false"/>
-                <w:b w:val="false"/>
-                <w:u w:val="none"/>
-                <w:strike w:val="false"/>
-                <w:sz w:val="22"/>
-                <w:szCs w:val="22"/>
-                <w:color w:val="000000"/>
-              </w:rPr>
-            </w:pPr>
-            <w:r xmlns:w="http://schemas.openxmlformats.org/wordprocessingml/2006/main" xmlns:wp="http://schemas.openxmlformats.org/drawingml/2006/wordprocessingDrawing" xmlns:r="http://schemas.openxmlformats.org/officeDocument/2006/relationships" xmlns:w14="http://schemas.microsoft.com/office/word/2010/wordml">
-              <w:rPr>
-                <w:rFonts w:ascii="Arial" w:hAnsi="Arial" w:eastAsia="Arial" w:cs="Arial"/>
-                <w:i w:val="false"/>
-                <w:b w:val="false"/>
-                <w:u w:val="none"/>
-                <w:strike w:val="false"/>
-                <w:sz w:val="22"/>
-                <w:szCs w:val="22"/>
-                <w:color w:val="000000"/>
-              </w:rPr>
-              <w:t xml:space="preserve">The probability of observing a set of events is based on a distribution and a set of defined parameters</w:t>
-            </w:r>
-          </w:p>
-        </w:tc>
-        <w:tc>
-          <w:tcPr>
-            <w:tcBorders>
-              <w:bottom w:val="single" w:sz="12" w:space="0" w:color="666666"/>
-              <w:top w:val="none" w:sz="0" w:space="0" w:color="000000"/>
-              <w:left w:val="none" w:sz="0" w:space="0" w:color="000000"/>
-              <w:right w:val="none" w:sz="0" w:space="0" w:color="000000"/>
-            </w:tcBorders>
-            <w:shd w:val="clear" w:color="auto" w:fill="FFFFFF"/>
-            <w:tcMar>
-              <w:top w:w="0" w:type="dxa"/>
-              <w:bottom w:w="0" w:type="dxa"/>
-              <w:left w:w="0" w:type="dxa"/>
-              <w:right w:w="0" w:type="dxa"/>
-            </w:tcMar>
-            <w:vAlign w:val="center"/>
-          </w:tcPr>
-          <w:p>
-            <w:pPr>
-              <w:jc w:val="left"/>
-              <w:pBdr>
-                <w:bottom w:val="none" w:sz="0" w:space="0" w:color="000000"/>
-                <w:top w:val="none" w:sz="0" w:space="0" w:color="000000"/>
-                <w:left w:val="none" w:sz="0" w:space="0" w:color="000000"/>
-                <w:right w:val="none" w:sz="0" w:space="0" w:color="000000"/>
-              </w:pBdr>
-              <w:spacing w:after="100" w:before="100" w:line="240"/>
-              <w:ind w:left="100" w:right="100" w:firstLine="0" w:firstLineChars="0"/>
-              <w:rPr>
-                <w:rFonts w:ascii="Arial" w:hAnsi="Arial" w:eastAsia="Arial" w:cs="Arial"/>
-                <w:i w:val="false"/>
-                <w:b w:val="false"/>
-                <w:u w:val="none"/>
-                <w:strike w:val="false"/>
-                <w:sz w:val="22"/>
-                <w:szCs w:val="22"/>
-                <w:color w:val="000000"/>
-              </w:rPr>
-            </w:pPr>
-            <w:r xmlns:w="http://schemas.openxmlformats.org/wordprocessingml/2006/main" xmlns:wp="http://schemas.openxmlformats.org/drawingml/2006/wordprocessingDrawing" xmlns:r="http://schemas.openxmlformats.org/officeDocument/2006/relationships" xmlns:w14="http://schemas.microsoft.com/office/word/2010/wordml">
+            <w:r>
               <w:rPr>
                 <w:rFonts w:ascii="Arial" w:hAnsi="Arial" w:eastAsia="Arial" w:cs="Arial"/>
                 <w:i w:val="false"/>
@@ -1803,27 +1911,27 @@
         <w:pStyle w:val="BodyText"/>
       </w:pPr>
       <w:r>
-        <w:t xml:space="preserve">As such, Bayesian statistics can greatly improve actuarial models by incorporating parameter risk without really changing our view on known information. Bayesian methods allow for the incorporation of prior knowledge (or what we like to call actuarial judgement) into our prior assumptions to influence our models. Lastly, technological advances have made Bayesian modeling more accessible by minimizing the computationally intensive hurdles.</w:t>
+        <w:t xml:space="preserve">As such, Bayesian statistics can greatly improve actuarial models by incorporating parameter risk without really changing our view on known information. Bayesian methods allow for the incorporation of prior knowledge (or what we like to call actuarial judgement) into our prior assumptions to influence our models. Lastly, technological advances have made Bayesian modeling more accessible by minimizing computationally intensive hurdles.</w:t>
       </w:r>
     </w:p>
     <w:bookmarkEnd w:id="29"/>
     <w:bookmarkEnd w:id="30"/>
-    <w:bookmarkStart w:id="46" w:name="bayesian-statistical-modelling"/>
+    <w:bookmarkStart w:id="34" w:name="bayesian-statistical-modelling"/>
     <w:p>
       <w:pPr>
         <w:pStyle w:val="Heading1"/>
       </w:pPr>
       <w:r>
-        <w:t xml:space="preserve">4 Bayesian Statistical Modelling</w:t>
-      </w:r>
-    </w:p>
-    <w:bookmarkStart w:id="37" w:name="basics-of-bayesian-statistics"/>
+        <w:t xml:space="preserve">4. Bayesian Statistical Modelling</w:t>
+      </w:r>
+    </w:p>
+    <w:bookmarkStart w:id="31" w:name="basics-of-bayesian-statistics"/>
     <w:p>
       <w:pPr>
         <w:pStyle w:val="Heading2"/>
       </w:pPr>
       <w:r>
-        <w:t xml:space="preserve">4.1 Basics of Bayesian Statistics</w:t>
+        <w:t xml:space="preserve">4.1. Basics of Bayesian Statistics</w:t>
       </w:r>
     </w:p>
     <w:p>
@@ -1831,7 +1939,7 @@
         <w:pStyle w:val="FirstParagraph"/>
       </w:pPr>
       <w:r>
-        <w:t xml:space="preserve">As mentioned previously, the foundation of Bayesian statistics is Bayes’ theorem. To give a brief refresher on what Bayes’ theorem is: Bayes’ theorem describes how to calculate an updated assumption (prior) beginning with a prior assumption and accounting for new information provided (historical evidence). It is represented by the formula below. Starting with the traditional definition where X and Y are some events and transforming it into our context where we have some observed data and</w:t>
+        <w:t xml:space="preserve">As mentioned previously, the foundation of Bayesian statistics is Bayes’ theorem. To give a brief refresher on what Bayes’ theorem is: Bayes’ theorem describes how to calculate an updated assumption (posterior) beginning with a prior assumption and accounting for new information provided (historical evidence). It is represented by the formula below. Starting with the traditional definition where X and Y are some events and transforming it into our context where we have some observed data and</w:t>
       </w:r>
       <w:r>
         <w:t xml:space="preserve"> </w:t>
@@ -2534,30 +2642,118 @@
         <w:pStyle w:val="BodyText"/>
       </w:pPr>
       <w:r>
-        <w:t xml:space="preserve">In the below charts, we see an example of the impact of a weak prior compared to a strong prior distribution on the resulting posterior distribution given the same likelihood function. Under a weak (wider variance) prior distribution, the resulting posterior distribution falls much closer to the observed likelihood of the data, allowing the data to overwhelm the prior distribution. Under a strong (tight variance) prior distribution, the resulting posterior distribution falls much closer to the prior since we are imposing a stricter belief about the parameter set and our result will in turn be much closer to that prior assumption.</w:t>
-      </w:r>
-    </w:p>
-    <w:p>
-      <w:pPr>
-        <w:pStyle w:val="BodyText"/>
-      </w:pPr>
-      <w:r>
+        <w:t xml:space="preserve">In</w:t>
+      </w:r>
+      <w:r>
+        <w:t xml:space="preserve"> </w:t>
+      </w:r>
+      <w:r>
+        <w:rPr>
+          <w:b/>
+          <w:bCs/>
+        </w:rPr>
+        <w:t xml:space="preserve">Figure</w:t>
+      </w:r>
+      <w:r>
+        <w:rPr>
+          <w:b/>
+          <w:bCs/>
+        </w:rPr>
+        <w:t xml:space="preserve"> </w:t>
+      </w:r>
+      <w:hyperlink w:anchor="prior_compare">
+        <w:r xmlns:w14="http://schemas.microsoft.com/office/word/2010/wordml">
+          <w:rPr/>
+          <w:fldChar w:fldCharType="begin" w:dirty="true"/>
+        </w:r>
+        <w:r xmlns:w14="http://schemas.microsoft.com/office/word/2010/wordml">
+          <w:rPr/>
+          <w:instrText xml:space="preserve" w:dirty="true"> REF prior_compare \h</w:instrText>
+        </w:r>
+        <w:r xmlns:w14="http://schemas.microsoft.com/office/word/2010/wordml">
+          <w:rPr/>
+          <w:fldChar w:fldCharType="end" w:dirty="true"/>
+        </w:r>
+      </w:hyperlink>
+      <w:r>
+        <w:t xml:space="preserve">, we see an example of the impact of a weak prior compared to a strong prior distribution on the resulting posterior distribution given the same likelihood function. Under a weak (wider variance) prior distribution, the resulting posterior distribution falls much closer to the observed likelihood of the data, allowing the data to overwhelm the prior distribution. Under a strong (tight variance) prior distribution, the resulting posterior distribution falls much closer to the prior since we are imposing a stricter belief about the parameter set and our result will in turn be much closer to that prior assumption.</w:t>
+      </w:r>
+    </w:p>
+    <w:p>
+      <w:pPr>
+        <w:pStyle w:val="ImageCaption"/>
+      </w:pPr>
+      <w:r>
+        <w:rPr>
+          <w:rFonts/>
+          <w:b w:val="true"/>
+          <w:strike w:val="false"/>
+        </w:rPr>
+        <w:t xml:space="preserve">Figure </w:t>
+      </w:r>
+      <w:bookmarkStart w:id="66656ebe-6ac1-494f-8b4e-e8ec0d222894" w:name="prior_compare"/>
+      <w:r xmlns:w14="http://schemas.microsoft.com/office/word/2010/wordml">
+        <w:rPr>
+          <w:rFonts/>
+          <w:b w:val="true"/>
+          <w:strike w:val="false"/>
+        </w:rPr>
+        <w:fldChar w:fldCharType="begin" w:dirty="true"/>
+      </w:r>
+      <w:r xmlns:w14="http://schemas.microsoft.com/office/word/2010/wordml">
+        <w:rPr>
+          <w:rFonts/>
+          <w:b w:val="true"/>
+          <w:strike w:val="false"/>
+        </w:rPr>
+        <w:instrText xml:space="preserve" w:dirty="true">SEQ fig \* Arabic</w:instrText>
+      </w:r>
+      <w:r xmlns:w14="http://schemas.microsoft.com/office/word/2010/wordml">
+        <w:rPr>
+          <w:rFonts/>
+          <w:b w:val="true"/>
+          <w:strike w:val="false"/>
+        </w:rPr>
+        <w:fldChar w:fldCharType="end" w:dirty="true"/>
+      </w:r>
+      <w:bookmarkEnd w:id="66656ebe-6ac1-494f-8b4e-e8ec0d222894"/>
+      <w:r>
+        <w:rPr>
+          <w:rFonts/>
+          <w:b w:val="true"/>
+          <w:strike w:val="false"/>
+        </w:rPr>
+        <w:t xml:space="preserve">: </w:t>
+      </w:r>
+      <w:r>
+        <w:t xml:space="preserve">Weak vs Strong Prior</w:t>
+      </w:r>
+    </w:p>
+    <w:p>
+      <w:pPr>
+        <w:jc w:val="center"/>
+        <w:pStyle w:val="Figure"/>
+      </w:pPr>
+      <w:r>
+        <w:rPr/>
         <w:drawing>
-          <wp:inline>
-            <wp:extent cx="2971800" cy="2954110"/>
-            <wp:effectExtent b="0" l="0" r="0" t="0"/>
-            <wp:docPr descr="" title="" id="32" name="Picture"/>
+          <wp:inline distT="0" distB="0" distL="0" distR="0">
+            <wp:extent cx="5486400" cy="2743200"/>
+            <wp:docPr id="1" name="" descr=""/>
+            <wp:cNvGraphicFramePr>
+              <a:graphicFrameLocks noChangeAspect="1"/>
+            </wp:cNvGraphicFramePr>
             <a:graphic>
               <a:graphicData uri="http://schemas.openxmlformats.org/drawingml/2006/picture">
                 <pic:pic>
                   <pic:nvPicPr>
-                    <pic:cNvPr descr="A Practical Guide to Using Bayesian Statistics_files/images/Prior - Weak.png" id="33" name="Picture"/>
+                    <pic:cNvPr id="2" name=""/>
                     <pic:cNvPicPr>
-                      <a:picLocks noChangeArrowheads="1" noChangeAspect="1"/>
+                      <a:picLocks noChangeAspect="1" noChangeArrowheads="1"/>
                     </pic:cNvPicPr>
                   </pic:nvPicPr>
                   <pic:blipFill>
-                    <a:blip r:embed="rId31"/>
+                    <a:blip r:embed="rId41"/>
                     <a:stretch>
                       <a:fillRect/>
                     </a:stretch>
@@ -2565,17 +2761,12 @@
                   <pic:spPr bwMode="auto">
                     <a:xfrm>
                       <a:off x="0" y="0"/>
-                      <a:ext cx="2971800" cy="2954110"/>
+                      <a:ext cx="5486400" cy="2743200"/>
                     </a:xfrm>
                     <a:prstGeom prst="rect">
                       <a:avLst/>
                     </a:prstGeom>
                     <a:noFill/>
-                    <a:ln w="9525">
-                      <a:noFill/>
-                      <a:headEnd/>
-                      <a:tailEnd/>
-                    </a:ln>
                   </pic:spPr>
                 </pic:pic>
               </a:graphicData>
@@ -2583,57 +2774,15 @@
           </wp:inline>
         </w:drawing>
       </w:r>
-      <w:r>
-        <w:drawing>
-          <wp:inline>
-            <wp:extent cx="2971800" cy="2958533"/>
-            <wp:effectExtent b="0" l="0" r="0" t="0"/>
-            <wp:docPr descr="" title="" id="35" name="Picture"/>
-            <a:graphic>
-              <a:graphicData uri="http://schemas.openxmlformats.org/drawingml/2006/picture">
-                <pic:pic>
-                  <pic:nvPicPr>
-                    <pic:cNvPr descr="A Practical Guide to Using Bayesian Statistics_files/images/Prior - Strong.png" id="36" name="Picture"/>
-                    <pic:cNvPicPr>
-                      <a:picLocks noChangeArrowheads="1" noChangeAspect="1"/>
-                    </pic:cNvPicPr>
-                  </pic:nvPicPr>
-                  <pic:blipFill>
-                    <a:blip r:embed="rId34"/>
-                    <a:stretch>
-                      <a:fillRect/>
-                    </a:stretch>
-                  </pic:blipFill>
-                  <pic:spPr bwMode="auto">
-                    <a:xfrm>
-                      <a:off x="0" y="0"/>
-                      <a:ext cx="2971800" cy="2958533"/>
-                    </a:xfrm>
-                    <a:prstGeom prst="rect">
-                      <a:avLst/>
-                    </a:prstGeom>
-                    <a:noFill/>
-                    <a:ln w="9525">
-                      <a:noFill/>
-                      <a:headEnd/>
-                      <a:tailEnd/>
-                    </a:ln>
-                  </pic:spPr>
-                </pic:pic>
-              </a:graphicData>
-            </a:graphic>
-          </wp:inline>
-        </w:drawing>
-      </w:r>
-    </w:p>
-    <w:bookmarkEnd w:id="37"/>
-    <w:bookmarkStart w:id="38" w:name="markov-chain-monte-carlo-mcmc"/>
+    </w:p>
+    <w:bookmarkEnd w:id="31"/>
+    <w:bookmarkStart w:id="32" w:name="markov-chain-monte-carlo-mcmc"/>
     <w:p>
       <w:pPr>
         <w:pStyle w:val="Heading2"/>
       </w:pPr>
       <w:r>
-        <w:t xml:space="preserve">4.2 Markov Chain Monte Carlo (MCMC)</w:t>
+        <w:t xml:space="preserve">4.2. Markov Chain Monte Carlo (MCMC)</w:t>
       </w:r>
     </w:p>
     <w:p>
@@ -2641,7 +2790,7 @@
         <w:pStyle w:val="FirstParagraph"/>
       </w:pPr>
       <w:r>
-        <w:t xml:space="preserve">MCMC methods are an effective way of using Bayesian statistics in actuarial models. By effective, we mean that these methods can replace the need to deal with the complex integral in the denominator of Bayes’ theorem. Lets start by breaking down the term Markov Chain Monte Carlo:</w:t>
+        <w:t xml:space="preserve">MCMC methods are an effective way of using Bayesian statistics in actuarial models. By effective, we mean that these methods can replace the need to deal with the complex integral in the denominator of Bayes’ theorem. Let’s start by breaking down the term Markov Chain Monte Carlo:</w:t>
       </w:r>
     </w:p>
     <w:p>
@@ -2732,7 +2881,23 @@
         <w:t xml:space="preserve"> </w:t>
       </w:r>
       <w:r>
-        <w:t xml:space="preserve">methods together, MCMC is a way to gather a representation of the posterior distribution via simulation and repeated sampling.</w:t>
+        <w:t xml:space="preserve">methods together,</w:t>
+      </w:r>
+      <w:r>
+        <w:t xml:space="preserve"> </w:t>
+      </w:r>
+      <w:r>
+        <w:rPr>
+          <w:b/>
+          <w:bCs/>
+        </w:rPr>
+        <w:t xml:space="preserve">MCMC</w:t>
+      </w:r>
+      <w:r>
+        <w:t xml:space="preserve"> </w:t>
+      </w:r>
+      <w:r>
+        <w:t xml:space="preserve">is a way to gather a representation of the posterior distribution via simulation and repeated sampling.</w:t>
       </w:r>
     </w:p>
     <w:p>
@@ -2764,7 +2929,7 @@
         <w:pStyle w:val="BodyText"/>
       </w:pPr>
       <w:r>
-        <w:t xml:space="preserve">Now, when the frog jumps to a new lily pad, the decision to stay on that lily pad is dependent on how much the frog likes that lily pad. The frog likes a lily pads based on how much sunlight it gets there (i.e., this is a likelihood function). If the frog doesn’t like how much sunlight it gets at the new lily pad, imagine that the frog forgets that it ever jumped to it and goes back to their previous lily pad before jumping again.</w:t>
+        <w:t xml:space="preserve">Now, when the frog jumps to a new lily pad, the decision to stay on that lily pad is dependent on how much the frog likes that lily pad. The frog likes a lily pad based on how much sunlight it gets there (i.e., this is a likelihood function). If the frog doesn’t like how much sunlight it gets at the new lily pad, imagine that the frog forgets that it ever jumped to it and goes back to their previous lily pad before jumping again.</w:t>
       </w:r>
     </w:p>
     <w:p>
@@ -2799,14 +2964,14 @@
         <w:t xml:space="preserve">This example is a version of the Metropolis-Hastings algorithm, which is a form of an MCMC process. There are several forms of MCMC processes: Gibbs sampling, Metropolis-Hastings, Hamiltonian Monte Carlo, etc. The specifics of how each one works are beyond the scope of this paper.</w:t>
       </w:r>
     </w:p>
-    <w:bookmarkEnd w:id="38"/>
-    <w:bookmarkStart w:id="45" w:name="execution-of-mcmc"/>
+    <w:bookmarkEnd w:id="32"/>
+    <w:bookmarkStart w:id="33" w:name="execution-of-mcmc"/>
     <w:p>
       <w:pPr>
         <w:pStyle w:val="Heading2"/>
       </w:pPr>
       <w:r>
-        <w:t xml:space="preserve">4.3 Execution of MCMC</w:t>
+        <w:t xml:space="preserve">4.3. Execution of MCMC</w:t>
       </w:r>
     </w:p>
     <w:p>
@@ -2822,7 +2987,7 @@
         <w:pStyle w:val="BodyText"/>
       </w:pPr>
       <w:r>
-        <w:t xml:space="preserve">There are many parameters that help in the simulation process of MCMC (e.g., thinning), most of which are beyond the scope of this paper. However, two related parameters that are important to fitting a model are iterations and chains. Iterations are simply the number of times you want the Monte Carlo process to repeat itself. Chains however, break up the iterations into segments. When a new chain is started, the Markov process starts from a new spot. For example, if we wanted to have 30,000 iterations, we could break the simulation up into 3 chains of 10,000 iterations each. In this example, we would have 3 random starting locations before each 10,000-iteration chain. This helps in understanding if the initial starting point influences the convergence of the chain (see discussion on anchoring above and trace plots below for more understanding).</w:t>
+        <w:t xml:space="preserve">There are many parameters that help in the simulation process of MCMC (e.g., thinning), most of which are beyond the scope of this paper. However, two related parameters that are very important to fitting a model are iterations and chains. Iterations are simply the number of times you want the Monte Carlo process to repeat itself. Chains break up the iterations into segments. When a new chain is started, the Markov process starts from a new spot. For example, if we wanted to have 30,000 iterations, we could break the simulation up into 3 chains of 10,000 iterations each. In this example, we would have 3 random starting locations before each 10,000-iteration chain. This helps in understanding if the initial starting point influences the convergence of the chain (see discussion on anchoring above and trace plots below for more understanding).</w:t>
       </w:r>
     </w:p>
     <w:p>
@@ -3047,7 +3212,7 @@
         <w:t xml:space="preserve"> </w:t>
       </w:r>
       <w:r>
-        <w:t xml:space="preserve">iterations are in the simulated results, and so we want a higher effective sample size relative to the number of total iterations in the simulation. For example, if we ran a model with 10,000 iterations, an effective sample size of 7,000 could be considered a positive sign that there is low correlation in the model, and an effective sample size of 200 would indicate that there is high correlation in the model.</w:t>
+        <w:t xml:space="preserve">iterations are in the simulated results, and so we want a higher effective sample size relative to the number of total iterations in the simulation. For example, if we ran a model with 10,000 iterations, an effective sample size of 7,000 could be considered a positive sign that there is low correlation in the model, and an effective sample size of 200 would indicate that there is high correlation in the model and may not be a well fit model.</w:t>
       </w:r>
     </w:p>
     <w:p>
@@ -3058,71 +3223,114 @@
         </w:numPr>
       </w:pPr>
       <w:r>
-        <w:t xml:space="preserve">Trace plots show the results of the MCMC model in sequential order of the simulation. Since the output of our model is parameter estimates, we would create a trace plot for each parameter with the iteration number as the x-axis and the corresponding simulated parameter value as the y-value and draw a connecting line so we can see the path of the simulation. Ideally, we would want a trace plot to appear random, like white noise, as a sign of well-mixing models and well-converged chains. Below comparing the left and right plot, the left plot is an example of well-mixed trace plot result, the points appear random, with no specific pattern in the lines, and all 3 chains are converging over the same region. The plot on the right is a not well-mixed model, as we see the orange line has a much higher mean across all iterations than the pink or blue lines.</w:t>
-      </w:r>
-    </w:p>
-    <w:p>
-      <w:pPr>
-        <w:numPr>
-          <w:ilvl w:val="0"/>
-          <w:numId w:val="1000"/>
-        </w:numPr>
-      </w:pPr>
-      <w:r>
+        <w:t xml:space="preserve">Trace plots show the results of the MCMC model in sequential order of the simulation. Since the output of our model is parameter estimates, we would create a trace plot for each parameter with the iteration number as the x-axis and the corresponding simulated parameter value as the y-value and draw a connecting line so we can see the path of the simulation. Ideally, we would want a trace plot to appear random, like white noise, as a sign of well-mixing models and well-converged chains. Comparing the left and right plots in</w:t>
+      </w:r>
+      <w:r>
+        <w:t xml:space="preserve"> </w:t>
+      </w:r>
+      <w:r>
+        <w:rPr>
+          <w:b/>
+          <w:bCs/>
+        </w:rPr>
+        <w:t xml:space="preserve">Figure</w:t>
+      </w:r>
+      <w:r>
+        <w:rPr>
+          <w:b/>
+          <w:bCs/>
+        </w:rPr>
+        <w:t xml:space="preserve"> </w:t>
+      </w:r>
+      <w:hyperlink w:anchor="trace_compare">
+        <w:r xmlns:w14="http://schemas.microsoft.com/office/word/2010/wordml">
+          <w:rPr/>
+          <w:fldChar w:fldCharType="begin" w:dirty="true"/>
+        </w:r>
+        <w:r xmlns:w14="http://schemas.microsoft.com/office/word/2010/wordml">
+          <w:rPr/>
+          <w:instrText xml:space="preserve" w:dirty="true"> REF trace_compare \h</w:instrText>
+        </w:r>
+        <w:r xmlns:w14="http://schemas.microsoft.com/office/word/2010/wordml">
+          <w:rPr/>
+          <w:fldChar w:fldCharType="end" w:dirty="true"/>
+        </w:r>
+      </w:hyperlink>
+      <w:r>
+        <w:t xml:space="preserve">, the left plot is an example of well-mixed trace plot result, the points appear random, with no specific pattern in the lines, and all 3 chains are converging over the same region. The plot on the right is a not well-mixed model, as we see the orange line has a much higher mean across all iterations than the pink or blue lines.</w:t>
+      </w:r>
+    </w:p>
+    <w:p>
+      <w:pPr>
+        <w:pStyle w:val="ImageCaption"/>
+      </w:pPr>
+      <w:r>
+        <w:rPr>
+          <w:rFonts/>
+          <w:b w:val="true"/>
+          <w:strike w:val="false"/>
+        </w:rPr>
+        <w:t xml:space="preserve">Figure </w:t>
+      </w:r>
+      <w:bookmarkStart w:id="177aa7d4-f10b-4c4a-a515-cdff566daa83" w:name="trace_compare"/>
+      <w:r xmlns:w14="http://schemas.microsoft.com/office/word/2010/wordml">
+        <w:rPr>
+          <w:rFonts/>
+          <w:b w:val="true"/>
+          <w:strike w:val="false"/>
+        </w:rPr>
+        <w:fldChar w:fldCharType="begin" w:dirty="true"/>
+      </w:r>
+      <w:r xmlns:w14="http://schemas.microsoft.com/office/word/2010/wordml">
+        <w:rPr>
+          <w:rFonts/>
+          <w:b w:val="true"/>
+          <w:strike w:val="false"/>
+        </w:rPr>
+        <w:instrText xml:space="preserve" w:dirty="true">SEQ fig \* Arabic</w:instrText>
+      </w:r>
+      <w:r xmlns:w14="http://schemas.microsoft.com/office/word/2010/wordml">
+        <w:rPr>
+          <w:rFonts/>
+          <w:b w:val="true"/>
+          <w:strike w:val="false"/>
+        </w:rPr>
+        <w:fldChar w:fldCharType="end" w:dirty="true"/>
+      </w:r>
+      <w:bookmarkEnd w:id="177aa7d4-f10b-4c4a-a515-cdff566daa83"/>
+      <w:r>
+        <w:rPr>
+          <w:rFonts/>
+          <w:b w:val="true"/>
+          <w:strike w:val="false"/>
+        </w:rPr>
+        <w:t xml:space="preserve">: </w:t>
+      </w:r>
+      <w:r>
+        <w:t xml:space="preserve">Good vs Bad Trace Plot</w:t>
+      </w:r>
+    </w:p>
+    <w:p>
+      <w:pPr>
+        <w:jc w:val="center"/>
+        <w:pStyle w:val="Figure"/>
+      </w:pPr>
+      <w:r>
+        <w:rPr/>
         <w:drawing>
-          <wp:inline>
-            <wp:extent cx="2792295" cy="2332026"/>
-            <wp:effectExtent b="0" l="0" r="0" t="0"/>
-            <wp:docPr descr="" title="" id="40" name="Picture"/>
+          <wp:inline distT="0" distB="0" distL="0" distR="0">
+            <wp:extent cx="5486400" cy="2286000"/>
+            <wp:docPr id="3" name="" descr=""/>
+            <wp:cNvGraphicFramePr>
+              <a:graphicFrameLocks noChangeAspect="1"/>
+            </wp:cNvGraphicFramePr>
             <a:graphic>
               <a:graphicData uri="http://schemas.openxmlformats.org/drawingml/2006/picture">
                 <pic:pic>
                   <pic:nvPicPr>
-                    <pic:cNvPr descr="A Practical Guide to Using Bayesian Statistics_files/images/Trace - Good.png" id="41" name="Picture"/>
+                    <pic:cNvPr id="4" name=""/>
                     <pic:cNvPicPr>
-                      <a:picLocks noChangeArrowheads="1" noChangeAspect="1"/>
-                    </pic:cNvPicPr>
-                  </pic:nvPicPr>
-                  <pic:blipFill>
-                    <a:blip r:embed="rId39"/>
-                    <a:stretch>
-                      <a:fillRect/>
-                    </a:stretch>
-                  </pic:blipFill>
-                  <pic:spPr bwMode="auto">
-                    <a:xfrm>
-                      <a:off x="0" y="0"/>
-                      <a:ext cx="2792295" cy="2332026"/>
-                    </a:xfrm>
-                    <a:prstGeom prst="rect">
-                      <a:avLst/>
-                    </a:prstGeom>
-                    <a:noFill/>
-                    <a:ln w="9525">
-                      <a:noFill/>
-                      <a:headEnd/>
-                      <a:tailEnd/>
-                    </a:ln>
-                  </pic:spPr>
-                </pic:pic>
-              </a:graphicData>
-            </a:graphic>
-          </wp:inline>
-        </w:drawing>
-      </w:r>
-      <w:r>
-        <w:drawing>
-          <wp:inline>
-            <wp:extent cx="2657283" cy="2227699"/>
-            <wp:effectExtent b="0" l="0" r="0" t="0"/>
-            <wp:docPr descr="" title="" id="43" name="Picture"/>
-            <a:graphic>
-              <a:graphicData uri="http://schemas.openxmlformats.org/drawingml/2006/picture">
-                <pic:pic>
-                  <pic:nvPicPr>
-                    <pic:cNvPr descr="A Practical Guide to Using Bayesian Statistics_files/images/Trace - Bad.png" id="44" name="Picture"/>
-                    <pic:cNvPicPr>
-                      <a:picLocks noChangeArrowheads="1" noChangeAspect="1"/>
+                      <a:picLocks noChangeAspect="1" noChangeArrowheads="1"/>
                     </pic:cNvPicPr>
                   </pic:nvPicPr>
                   <pic:blipFill>
@@ -3134,17 +3342,12 @@
                   <pic:spPr bwMode="auto">
                     <a:xfrm>
                       <a:off x="0" y="0"/>
-                      <a:ext cx="2657283" cy="2227699"/>
+                      <a:ext cx="5486400" cy="2286000"/>
                     </a:xfrm>
                     <a:prstGeom prst="rect">
                       <a:avLst/>
                     </a:prstGeom>
                     <a:noFill/>
-                    <a:ln w="9525">
-                      <a:noFill/>
-                      <a:headEnd/>
-                      <a:tailEnd/>
-                    </a:ln>
                   </pic:spPr>
                 </pic:pic>
               </a:graphicData>
@@ -3153,9 +3356,9 @@
         </w:drawing>
       </w:r>
     </w:p>
-    <w:bookmarkEnd w:id="45"/>
-    <w:bookmarkEnd w:id="46"/>
-    <w:bookmarkStart w:id="57" w:name="an-example-in-action"/>
+    <w:bookmarkEnd w:id="33"/>
+    <w:bookmarkEnd w:id="34"/>
+    <w:bookmarkStart w:id="35" w:name="an-example-in-action"/>
     <w:p>
       <w:pPr>
         <w:pStyle w:val="Heading1"/>
@@ -3177,30 +3380,121 @@
         <w:pStyle w:val="BodyText"/>
       </w:pPr>
       <w:r>
-        <w:t xml:space="preserve">First, let’s get the data we’ll be using in our example. Below is the history for 1983 through 2011.</w:t>
-      </w:r>
-    </w:p>
-    <w:p>
-      <w:pPr>
-        <w:pStyle w:val="BodyText"/>
-      </w:pPr>
-      <w:r>
+        <w:t xml:space="preserve">First, let’s get the data we’ll be using in our example.</w:t>
+      </w:r>
+      <w:r>
+        <w:t xml:space="preserve"> </w:t>
+      </w:r>
+      <w:r>
+        <w:rPr>
+          <w:b/>
+          <w:bCs/>
+        </w:rPr>
+        <w:t xml:space="preserve">Figure</w:t>
+      </w:r>
+      <w:r>
+        <w:rPr>
+          <w:b/>
+          <w:bCs/>
+        </w:rPr>
+        <w:t xml:space="preserve"> </w:t>
+      </w:r>
+      <w:hyperlink w:anchor="data_by_year">
+        <w:r xmlns:w14="http://schemas.microsoft.com/office/word/2010/wordml">
+          <w:rPr/>
+          <w:fldChar w:fldCharType="begin" w:dirty="true"/>
+        </w:r>
+        <w:r xmlns:w14="http://schemas.microsoft.com/office/word/2010/wordml">
+          <w:rPr/>
+          <w:instrText xml:space="preserve" w:dirty="true"> REF data_by_year \h</w:instrText>
+        </w:r>
+        <w:r xmlns:w14="http://schemas.microsoft.com/office/word/2010/wordml">
+          <w:rPr/>
+          <w:fldChar w:fldCharType="end" w:dirty="true"/>
+        </w:r>
+      </w:hyperlink>
+      <w:r>
+        <w:t xml:space="preserve"> </w:t>
+      </w:r>
+      <w:r>
+        <w:t xml:space="preserve">shows the history for 1983 through 2011.</w:t>
+      </w:r>
+    </w:p>
+    <w:p>
+      <w:pPr>
+        <w:pStyle w:val="ImageCaption"/>
+      </w:pPr>
+      <w:r>
+        <w:rPr>
+          <w:rFonts/>
+          <w:b w:val="true"/>
+          <w:strike w:val="false"/>
+        </w:rPr>
+        <w:t xml:space="preserve">Figure </w:t>
+      </w:r>
+      <w:bookmarkStart w:id="e183b37d-dc13-4f44-838f-fda0729297e0" w:name="data_by_year"/>
+      <w:r xmlns:w14="http://schemas.microsoft.com/office/word/2010/wordml">
+        <w:rPr>
+          <w:rFonts/>
+          <w:b w:val="true"/>
+          <w:strike w:val="false"/>
+        </w:rPr>
+        <w:fldChar w:fldCharType="begin" w:dirty="true"/>
+      </w:r>
+      <w:r xmlns:w14="http://schemas.microsoft.com/office/word/2010/wordml">
+        <w:rPr>
+          <w:rFonts/>
+          <w:b w:val="true"/>
+          <w:strike w:val="false"/>
+        </w:rPr>
+        <w:instrText xml:space="preserve" w:dirty="true">SEQ fig \* Arabic</w:instrText>
+      </w:r>
+      <w:r xmlns:w14="http://schemas.microsoft.com/office/word/2010/wordml">
+        <w:rPr>
+          <w:rFonts/>
+          <w:b w:val="true"/>
+          <w:strike w:val="false"/>
+        </w:rPr>
+        <w:fldChar w:fldCharType="end" w:dirty="true"/>
+      </w:r>
+      <w:bookmarkEnd w:id="e183b37d-dc13-4f44-838f-fda0729297e0"/>
+      <w:r>
+        <w:rPr>
+          <w:rFonts/>
+          <w:b w:val="true"/>
+          <w:strike w:val="false"/>
+        </w:rPr>
+        <w:t xml:space="preserve">: </w:t>
+      </w:r>
+      <w:r>
+        <w:t xml:space="preserve">Earthquake Frequency from 1983 to 2011</w:t>
+      </w:r>
+    </w:p>
+    <w:p>
+      <w:pPr>
+        <w:jc w:val="center"/>
+        <w:pStyle w:val="Figure"/>
+      </w:pPr>
+      <w:r>
+        <w:rPr/>
         <w:drawing>
-          <wp:inline>
-            <wp:extent cx="5544151" cy="3696101"/>
-            <wp:effectExtent b="0" l="0" r="0" t="0"/>
-            <wp:docPr descr="" title="" id="48" name="Picture"/>
+          <wp:inline distT="0" distB="0" distL="0" distR="0">
+            <wp:extent cx="5486400" cy="3657600"/>
+            <wp:docPr id="5" name="" descr=""/>
+            <wp:cNvGraphicFramePr>
+              <a:graphicFrameLocks noChangeAspect="1"/>
+            </wp:cNvGraphicFramePr>
             <a:graphic>
               <a:graphicData uri="http://schemas.openxmlformats.org/drawingml/2006/picture">
                 <pic:pic>
                   <pic:nvPicPr>
-                    <pic:cNvPr descr="A Practical Guide to Using Bayesian Statistics_files/A Practical Guide to Using Bayesian Statistics_files/figure-docx/data_by_year-1.png" id="49" name="Picture"/>
+                    <pic:cNvPr id="6" name=""/>
                     <pic:cNvPicPr>
-                      <a:picLocks noChangeArrowheads="1" noChangeAspect="1"/>
+                      <a:picLocks noChangeAspect="1" noChangeArrowheads="1"/>
                     </pic:cNvPicPr>
                   </pic:nvPicPr>
                   <pic:blipFill>
-                    <a:blip r:embed="rId47"/>
+                    <a:blip r:embed="rId43"/>
                     <a:stretch>
                       <a:fillRect/>
                     </a:stretch>
@@ -3208,17 +3502,12 @@
                   <pic:spPr bwMode="auto">
                     <a:xfrm>
                       <a:off x="0" y="0"/>
-                      <a:ext cx="5544151" cy="3696101"/>
+                      <a:ext cx="5486400" cy="3657600"/>
                     </a:xfrm>
                     <a:prstGeom prst="rect">
                       <a:avLst/>
                     </a:prstGeom>
                     <a:noFill/>
-                    <a:ln w="9525">
-                      <a:noFill/>
-                      <a:headEnd/>
-                      <a:tailEnd/>
-                    </a:ln>
                   </pic:spPr>
                 </pic:pic>
               </a:graphicData>
@@ -3451,11 +3740,6 @@
       </w:pPr>
       <w:r>
         <w:t xml:space="preserve">After running another 10,000 simulations, you’re left with a central estimate of 182.87. Even though we let lambda vary, the result is still quite close to the point estimate.</w:t>
-      </w:r>
-    </w:p>
-    <w:p>
-      <w:r>
-        <w:br w:type="page"/>
       </w:r>
     </w:p>
     <w:p>
@@ -3695,30 +3979,118 @@
         <w:pStyle w:val="BodyText"/>
       </w:pPr>
       <w:r>
-        <w:t xml:space="preserve">Let’s compare each result to the true number of earthquakes that occurred in 2012 (133).</w:t>
-      </w:r>
-    </w:p>
-    <w:p>
-      <w:pPr>
-        <w:pStyle w:val="BodyText"/>
-      </w:pPr>
-      <w:r>
+        <w:t xml:space="preserve">Let’s compare each result to the true number of earthquakes that occurred in 2012, which was 133. The results are shown in</w:t>
+      </w:r>
+      <w:r>
+        <w:t xml:space="preserve"> </w:t>
+      </w:r>
+      <w:r>
+        <w:rPr>
+          <w:b/>
+          <w:bCs/>
+        </w:rPr>
+        <w:t xml:space="preserve">Figure</w:t>
+      </w:r>
+      <w:r>
+        <w:rPr>
+          <w:b/>
+          <w:bCs/>
+        </w:rPr>
+        <w:t xml:space="preserve"> </w:t>
+      </w:r>
+      <w:hyperlink w:anchor="compare_true">
+        <w:r xmlns:w14="http://schemas.microsoft.com/office/word/2010/wordml">
+          <w:rPr/>
+          <w:fldChar w:fldCharType="begin" w:dirty="true"/>
+        </w:r>
+        <w:r xmlns:w14="http://schemas.microsoft.com/office/word/2010/wordml">
+          <w:rPr/>
+          <w:instrText xml:space="preserve" w:dirty="true"> REF compare_true \h</w:instrText>
+        </w:r>
+        <w:r xmlns:w14="http://schemas.microsoft.com/office/word/2010/wordml">
+          <w:rPr/>
+          <w:fldChar w:fldCharType="end" w:dirty="true"/>
+        </w:r>
+      </w:hyperlink>
+      <w:r>
+        <w:t xml:space="preserve">.</w:t>
+      </w:r>
+    </w:p>
+    <w:p>
+      <w:pPr>
+        <w:pStyle w:val="ImageCaption"/>
+      </w:pPr>
+      <w:r>
+        <w:rPr>
+          <w:rFonts/>
+          <w:b w:val="true"/>
+          <w:strike w:val="false"/>
+        </w:rPr>
+        <w:t xml:space="preserve">Figure </w:t>
+      </w:r>
+      <w:bookmarkStart w:id="82f3855d-2540-4bef-89f0-15b6b78fcb99" w:name="compare_true"/>
+      <w:r xmlns:w14="http://schemas.microsoft.com/office/word/2010/wordml">
+        <w:rPr>
+          <w:rFonts/>
+          <w:b w:val="true"/>
+          <w:strike w:val="false"/>
+        </w:rPr>
+        <w:fldChar w:fldCharType="begin" w:dirty="true"/>
+      </w:r>
+      <w:r xmlns:w14="http://schemas.microsoft.com/office/word/2010/wordml">
+        <w:rPr>
+          <w:rFonts/>
+          <w:b w:val="true"/>
+          <w:strike w:val="false"/>
+        </w:rPr>
+        <w:instrText xml:space="preserve" w:dirty="true">SEQ fig \* Arabic</w:instrText>
+      </w:r>
+      <w:r xmlns:w14="http://schemas.microsoft.com/office/word/2010/wordml">
+        <w:rPr>
+          <w:rFonts/>
+          <w:b w:val="true"/>
+          <w:strike w:val="false"/>
+        </w:rPr>
+        <w:fldChar w:fldCharType="end" w:dirty="true"/>
+      </w:r>
+      <w:bookmarkEnd w:id="82f3855d-2540-4bef-89f0-15b6b78fcb99"/>
+      <w:r>
+        <w:rPr>
+          <w:rFonts/>
+          <w:b w:val="true"/>
+          <w:strike w:val="false"/>
+        </w:rPr>
+        <w:t xml:space="preserve">: </w:t>
+      </w:r>
+      <w:r>
+        <w:t xml:space="preserve">Distribution of Method Results</w:t>
+      </w:r>
+    </w:p>
+    <w:p>
+      <w:pPr>
+        <w:jc w:val="center"/>
+        <w:pStyle w:val="Figure"/>
+      </w:pPr>
+      <w:r>
+        <w:rPr/>
         <w:drawing>
-          <wp:inline>
-            <wp:extent cx="5544151" cy="3696101"/>
-            <wp:effectExtent b="0" l="0" r="0" t="0"/>
-            <wp:docPr descr="" title="" id="51" name="Picture"/>
+          <wp:inline distT="0" distB="0" distL="0" distR="0">
+            <wp:extent cx="5486400" cy="3657600"/>
+            <wp:docPr id="7" name="" descr=""/>
+            <wp:cNvGraphicFramePr>
+              <a:graphicFrameLocks noChangeAspect="1"/>
+            </wp:cNvGraphicFramePr>
             <a:graphic>
               <a:graphicData uri="http://schemas.openxmlformats.org/drawingml/2006/picture">
                 <pic:pic>
                   <pic:nvPicPr>
-                    <pic:cNvPr descr="A Practical Guide to Using Bayesian Statistics_files/A Practical Guide to Using Bayesian Statistics_files/figure-docx/compare_true-1.png" id="52" name="Picture"/>
+                    <pic:cNvPr id="8" name=""/>
                     <pic:cNvPicPr>
-                      <a:picLocks noChangeArrowheads="1" noChangeAspect="1"/>
+                      <a:picLocks noChangeAspect="1" noChangeArrowheads="1"/>
                     </pic:cNvPicPr>
                   </pic:nvPicPr>
                   <pic:blipFill>
-                    <a:blip r:embed="rId50"/>
+                    <a:blip r:embed="rId44"/>
                     <a:stretch>
                       <a:fillRect/>
                     </a:stretch>
@@ -3726,17 +4098,12 @@
                   <pic:spPr bwMode="auto">
                     <a:xfrm>
                       <a:off x="0" y="0"/>
-                      <a:ext cx="5544151" cy="3696101"/>
+                      <a:ext cx="5486400" cy="3657600"/>
                     </a:xfrm>
                     <a:prstGeom prst="rect">
                       <a:avLst/>
                     </a:prstGeom>
                     <a:noFill/>
-                    <a:ln w="9525">
-                      <a:noFill/>
-                      <a:headEnd/>
-                      <a:tailEnd/>
-                    </a:ln>
                   </pic:spPr>
                 </pic:pic>
               </a:graphicData>
@@ -3750,19 +4117,7 @@
         <w:pStyle w:val="BodyText"/>
       </w:pPr>
       <w:r>
-        <w:t xml:space="preserve">It appears that all four methods severely overestimated the true average frequency. However, if we look at the Bayesian versus the other three, the true count is a more likely outcome. The</w:t>
-      </w:r>
-      <w:r>
-        <w:t xml:space="preserve"> </w:t>
-      </w:r>
-      <w:r>
-        <w:t xml:space="preserve">“true count”</w:t>
-      </w:r>
-      <w:r>
-        <w:t xml:space="preserve"> </w:t>
-      </w:r>
-      <w:r>
-        <w:t xml:space="preserve">is approximately equal to the 3.3% confidence level of our Bayesian estimate. While this may still seem low, it is relatively close to the proportion of historical counts below 133 (6.9%).</w:t>
+        <w:t xml:space="preserve">It appears that all four methods severely overestimated the true average frequency. However, if we look at the Bayesian versus the other three, the true count is a more likely outcome. The true count is approximately equal to the 3.3% confidence level of our Bayesian estimate. While this may still seem low, it is relatively close to the proportion of historical counts below 133 (6.9%).</w:t>
       </w:r>
     </w:p>
     <w:p>
@@ -3826,30 +4181,118 @@
         </w:numPr>
       </w:pPr>
       <w:r>
-        <w:t xml:space="preserve">Regression to the mean: As seen below, the high average for 2007-2011 was followed by a low average in 2012-2023. This resulted in the new all-year average (1983-2023) being nearly identical to the all-year average before the rise (1983-2006).</w:t>
-      </w:r>
-    </w:p>
-    <w:p>
-      <w:pPr>
-        <w:pStyle w:val="FirstParagraph"/>
-      </w:pPr>
-      <w:r>
+        <w:t xml:space="preserve">Regression to the mean: As seen in</w:t>
+      </w:r>
+      <w:r>
+        <w:t xml:space="preserve"> </w:t>
+      </w:r>
+      <w:r>
+        <w:rPr>
+          <w:b/>
+          <w:bCs/>
+        </w:rPr>
+        <w:t xml:space="preserve">Figure</w:t>
+      </w:r>
+      <w:r>
+        <w:rPr>
+          <w:b/>
+          <w:bCs/>
+        </w:rPr>
+        <w:t xml:space="preserve"> </w:t>
+      </w:r>
+      <w:hyperlink w:anchor="plot_full">
+        <w:r xmlns:w14="http://schemas.microsoft.com/office/word/2010/wordml">
+          <w:rPr/>
+          <w:fldChar w:fldCharType="begin" w:dirty="true"/>
+        </w:r>
+        <w:r xmlns:w14="http://schemas.microsoft.com/office/word/2010/wordml">
+          <w:rPr/>
+          <w:instrText xml:space="preserve" w:dirty="true"> REF plot_full \h</w:instrText>
+        </w:r>
+        <w:r xmlns:w14="http://schemas.microsoft.com/office/word/2010/wordml">
+          <w:rPr/>
+          <w:fldChar w:fldCharType="end" w:dirty="true"/>
+        </w:r>
+      </w:hyperlink>
+      <w:r>
+        <w:t xml:space="preserve">, the high average for 2007-2011 was followed by a low average in 2012-2023. This resulted in the new all-year average (1983-2023) being nearly identical to the all-year average before the rise (1983-2006).</w:t>
+      </w:r>
+    </w:p>
+    <w:p>
+      <w:pPr>
+        <w:pStyle w:val="ImageCaption"/>
+      </w:pPr>
+      <w:r>
+        <w:rPr>
+          <w:rFonts/>
+          <w:b w:val="true"/>
+          <w:strike w:val="false"/>
+        </w:rPr>
+        <w:t xml:space="preserve">Figure </w:t>
+      </w:r>
+      <w:bookmarkStart w:id="f5c54ab2-2011-4015-a4cf-8dec98a7e3a3" w:name="plot_full"/>
+      <w:r xmlns:w14="http://schemas.microsoft.com/office/word/2010/wordml">
+        <w:rPr>
+          <w:rFonts/>
+          <w:b w:val="true"/>
+          <w:strike w:val="false"/>
+        </w:rPr>
+        <w:fldChar w:fldCharType="begin" w:dirty="true"/>
+      </w:r>
+      <w:r xmlns:w14="http://schemas.microsoft.com/office/word/2010/wordml">
+        <w:rPr>
+          <w:rFonts/>
+          <w:b w:val="true"/>
+          <w:strike w:val="false"/>
+        </w:rPr>
+        <w:instrText xml:space="preserve" w:dirty="true">SEQ fig \* Arabic</w:instrText>
+      </w:r>
+      <w:r xmlns:w14="http://schemas.microsoft.com/office/word/2010/wordml">
+        <w:rPr>
+          <w:rFonts/>
+          <w:b w:val="true"/>
+          <w:strike w:val="false"/>
+        </w:rPr>
+        <w:fldChar w:fldCharType="end" w:dirty="true"/>
+      </w:r>
+      <w:bookmarkEnd w:id="f5c54ab2-2011-4015-a4cf-8dec98a7e3a3"/>
+      <w:r>
+        <w:rPr>
+          <w:rFonts/>
+          <w:b w:val="true"/>
+          <w:strike w:val="false"/>
+        </w:rPr>
+        <w:t xml:space="preserve">: </w:t>
+      </w:r>
+      <w:r>
+        <w:t xml:space="preserve">Earthquake Frequency from 1983 to 2023</w:t>
+      </w:r>
+    </w:p>
+    <w:p>
+      <w:pPr>
+        <w:jc w:val="center"/>
+        <w:pStyle w:val="Figure"/>
+      </w:pPr>
+      <w:r>
+        <w:rPr/>
         <w:drawing>
-          <wp:inline>
-            <wp:extent cx="5544151" cy="3696101"/>
-            <wp:effectExtent b="0" l="0" r="0" t="0"/>
-            <wp:docPr descr="" title="" id="54" name="Picture"/>
+          <wp:inline distT="0" distB="0" distL="0" distR="0">
+            <wp:extent cx="5486400" cy="3657600"/>
+            <wp:docPr id="9" name="" descr=""/>
+            <wp:cNvGraphicFramePr>
+              <a:graphicFrameLocks noChangeAspect="1"/>
+            </wp:cNvGraphicFramePr>
             <a:graphic>
               <a:graphicData uri="http://schemas.openxmlformats.org/drawingml/2006/picture">
                 <pic:pic>
                   <pic:nvPicPr>
-                    <pic:cNvPr descr="A Practical Guide to Using Bayesian Statistics_files/A Practical Guide to Using Bayesian Statistics_files/figure-docx/plot_full-1.png" id="55" name="Picture"/>
+                    <pic:cNvPr id="10" name=""/>
                     <pic:cNvPicPr>
-                      <a:picLocks noChangeArrowheads="1" noChangeAspect="1"/>
+                      <a:picLocks noChangeAspect="1" noChangeArrowheads="1"/>
                     </pic:cNvPicPr>
                   </pic:nvPicPr>
                   <pic:blipFill>
-                    <a:blip r:embed="rId53"/>
+                    <a:blip r:embed="rId45"/>
                     <a:stretch>
                       <a:fillRect/>
                     </a:stretch>
@@ -3857,17 +4300,12 @@
                   <pic:spPr bwMode="auto">
                     <a:xfrm>
                       <a:off x="0" y="0"/>
-                      <a:ext cx="5544151" cy="3696101"/>
+                      <a:ext cx="5486400" cy="3657600"/>
                     </a:xfrm>
                     <a:prstGeom prst="rect">
                       <a:avLst/>
                     </a:prstGeom>
                     <a:noFill/>
-                    <a:ln w="9525">
-                      <a:noFill/>
-                      <a:headEnd/>
-                      <a:tailEnd/>
-                    </a:ln>
                   </pic:spPr>
                 </pic:pic>
               </a:graphicData>
@@ -3876,9 +4314,19 @@
         </w:drawing>
       </w:r>
     </w:p>
-    <w:p>
-      <w:pPr>
-        <w:pStyle w:val="BodyText"/>
+    <w:bookmarkEnd w:id="35"/>
+    <w:bookmarkStart w:id="42" w:name="conclusion"/>
+    <w:p>
+      <w:pPr>
+        <w:pStyle w:val="Heading1"/>
+      </w:pPr>
+      <w:r>
+        <w:t xml:space="preserve">6. Conclusion</w:t>
+      </w:r>
+    </w:p>
+    <w:p>
+      <w:pPr>
+        <w:pStyle w:val="FirstParagraph"/>
       </w:pPr>
       <w:r>
         <w:t xml:space="preserve">As we have shown, there are numerous ways one can go about forecasting a value for a future period. In the most basic approach, weighted averages provide an easy and explainable answer, but it fails to account for process and parameter risk. By leveraging Bayesian MCMC methods, the results will account for those risks</w:t>
@@ -3887,34 +4335,15 @@
         <w:rPr>
           <w:rStyle w:val="FootnoteReference"/>
         </w:rPr>
-        <w:footnoteReference w:id="56"/>
-      </w:r>
-      <w:r>
-        <w:t xml:space="preserve">, but at the cost of being more time consuming and less explainable. The decision of which model to use will ultimately come down to personal preference, business considerations, and programming expertise. However, we believe that will the example above and provided supplementary files, you will have the skill set needed to make an informed decision.</w:t>
-      </w:r>
-    </w:p>
-    <w:bookmarkEnd w:id="57"/>
-    <w:bookmarkStart w:id="71" w:name="supplemental-information"/>
-    <w:p>
-      <w:pPr>
-        <w:pStyle w:val="Heading1"/>
-      </w:pPr>
-      <w:r>
-        <w:t xml:space="preserve">6. Supplemental Information</w:t>
-      </w:r>
-    </w:p>
-    <w:bookmarkStart w:id="58" w:name="literature-review"/>
-    <w:p>
-      <w:pPr>
-        <w:pStyle w:val="Heading2"/>
-      </w:pPr>
-      <w:r>
-        <w:t xml:space="preserve">6.1 Literature Review</w:t>
-      </w:r>
-    </w:p>
-    <w:p>
-      <w:pPr>
-        <w:pStyle w:val="FirstParagraph"/>
+        <w:footnoteReference w:id="36"/>
+      </w:r>
+      <w:r>
+        <w:t xml:space="preserve">, but at the cost of being more time consuming and less explainable. The decision of which model to use will ultimately come down to personal preference, business considerations, and programming expertise. However, we believe that with the example above and provided supplementary files, you will have the skill set needed to make an informed decision.</w:t>
+      </w:r>
+    </w:p>
+    <w:p>
+      <w:pPr>
+        <w:pStyle w:val="BodyText"/>
       </w:pPr>
       <w:r>
         <w:t xml:space="preserve">While our paper focused on the usage of Bayesian MCMC methods for forecasting purposes, the methods can and have been used in other applications. We provide a non-exhaustive list below of papers that utilize these methods to some extent:</w:t>
@@ -3988,14 +4417,13 @@
         <w:t xml:space="preserve">We believe there are several other possible applications, ranging from the selection of development factors to estimating reserve variability. We leave it to the reader to explore these.</w:t>
       </w:r>
     </w:p>
-    <w:bookmarkEnd w:id="58"/>
-    <w:bookmarkStart w:id="59" w:name="acknowledgements"/>
+    <w:bookmarkStart w:id="37" w:name="acknowledgements"/>
     <w:p>
       <w:pPr>
         <w:pStyle w:val="Heading2"/>
       </w:pPr>
       <w:r>
-        <w:t xml:space="preserve">6.2 Acknowledgements</w:t>
+        <w:t xml:space="preserve">Acknowledgements</w:t>
       </w:r>
     </w:p>
     <w:p>
@@ -4003,17 +4431,17 @@
         <w:pStyle w:val="FirstParagraph"/>
       </w:pPr>
       <w:r>
-        <w:t xml:space="preserve">We would like to extend our gratitude to our colleagues for their thoughtful reviews.</w:t>
-      </w:r>
-    </w:p>
-    <w:bookmarkEnd w:id="59"/>
-    <w:bookmarkStart w:id="60" w:name="biographies-of-the-authors"/>
+        <w:t xml:space="preserve">We would like to extend our gratitude to our current and former colleagues for their thoughtful reviews.</w:t>
+      </w:r>
+    </w:p>
+    <w:bookmarkEnd w:id="37"/>
+    <w:bookmarkStart w:id="38" w:name="biographies-of-the-authors"/>
     <w:p>
       <w:pPr>
         <w:pStyle w:val="Heading2"/>
       </w:pPr>
       <w:r>
-        <w:t xml:space="preserve">6.3 Biographies of the Authors</w:t>
+        <w:t xml:space="preserve">Biographies of the Authors</w:t>
       </w:r>
     </w:p>
     <w:p>
@@ -4029,17 +4457,17 @@
         <w:pStyle w:val="BodyText"/>
       </w:pPr>
       <w:r>
-        <w:t xml:space="preserve">Kenneth is a Director with Willis Towers Watson. He holds a Bachelor of Science degree in Actuarial Mathematics and Statistics from the University of Pittsburgh. Kenny is a Fellow of the Casualty Actuarial Society and a Member of the American Academy of Actuaries.</w:t>
-      </w:r>
-    </w:p>
-    <w:bookmarkEnd w:id="60"/>
-    <w:bookmarkStart w:id="61" w:name="citations"/>
+        <w:t xml:space="preserve">Kenneth is a Director with WTW. He holds a Bachelor of Science degree in Actuarial Mathematics and Statistics from the University of Pittsburgh. Kenny is a Fellow of the Casualty Actuarial Society and a Member of the American Academy of Actuaries.</w:t>
+      </w:r>
+    </w:p>
+    <w:bookmarkEnd w:id="38"/>
+    <w:bookmarkStart w:id="41" w:name="citations"/>
     <w:p>
       <w:pPr>
         <w:pStyle w:val="Heading2"/>
       </w:pPr>
       <w:r>
-        <w:t xml:space="preserve">6.4 Citations</w:t>
+        <w:t xml:space="preserve">Citations</w:t>
       </w:r>
     </w:p>
     <w:p>
@@ -4047,19 +4475,19 @@
         <w:pStyle w:val="FirstParagraph"/>
       </w:pPr>
       <w:r>
-        <w:t xml:space="preserve">A. Tversky, and D. Kahneman. 1974.</w:t>
-      </w:r>
-      <w:r>
-        <w:t xml:space="preserve"> </w:t>
-      </w:r>
-      <w:r>
-        <w:t xml:space="preserve">“Judgment Under Uncertainty: Heuristics and Biases.”</w:t>
-      </w:r>
-      <w:r>
-        <w:t xml:space="preserve"> </w:t>
-      </w:r>
-      <w:r>
-        <w:t xml:space="preserve">Science 185, 1124–1131.</w:t>
+        <w:t xml:space="preserve">Aminzadeh and Deng. 2022.</w:t>
+      </w:r>
+      <w:r>
+        <w:t xml:space="preserve"> </w:t>
+      </w:r>
+      <w:r>
+        <w:t xml:space="preserve">“Bayesian Estimation of Renewal Function Based on Pareto-Distributed Inter-Arrival Times via an MCMC Algorithm.”</w:t>
+      </w:r>
+      <w:r>
+        <w:t xml:space="preserve"> </w:t>
+      </w:r>
+      <w:r>
+        <w:t xml:space="preserve">Variance 15 (2).</w:t>
       </w:r>
     </w:p>
     <w:p>
@@ -4067,215 +4495,7 @@
         <w:pStyle w:val="BodyText"/>
       </w:pPr>
       <w:r>
-        <w:t xml:space="preserve">Aminzadeh, M.S., and Min Deng. 2022.</w:t>
-      </w:r>
-      <w:r>
-        <w:t xml:space="preserve"> </w:t>
-      </w:r>
-      <w:r>
-        <w:t xml:space="preserve">“Bayesian Estimation of Renewal Function Based on Pareto-Distributed Inter-Arrival Times via an MCMC Algorithm.”</w:t>
-      </w:r>
-      <w:r>
-        <w:t xml:space="preserve"> </w:t>
-      </w:r>
-      <w:r>
-        <w:t xml:space="preserve">Variance 15 (2).</w:t>
-      </w:r>
-    </w:p>
-    <w:p>
-      <w:pPr>
-        <w:pStyle w:val="BodyText"/>
-      </w:pPr>
-      <w:r>
-        <w:t xml:space="preserve">Ford, Patrick.</w:t>
-      </w:r>
-      <w:r>
-        <w:t xml:space="preserve"> </w:t>
-      </w:r>
-      <w:r>
-        <w:rPr>
-          <w:i/>
-          <w:iCs/>
-        </w:rPr>
-        <w:t xml:space="preserve">MCMC Algorithms</w:t>
-      </w:r>
-      <w:r>
-        <w:t xml:space="preserve">. Casualty Actuarial Society, April 2018.</w:t>
-      </w:r>
-    </w:p>
-    <w:p>
-      <w:pPr>
-        <w:pStyle w:val="BodyText"/>
-      </w:pPr>
-      <w:r>
-        <w:t xml:space="preserve">Meyers, G. 2015.</w:t>
-      </w:r>
-      <w:r>
-        <w:t xml:space="preserve"> </w:t>
-      </w:r>
-      <w:r>
-        <w:t xml:space="preserve">“Stochastic Loss Reserving Using Bayesian MCMC Models.”</w:t>
-      </w:r>
-      <w:r>
-        <w:t xml:space="preserve"> </w:t>
-      </w:r>
-      <w:r>
-        <w:t xml:space="preserve">CAS Monograph #1.</w:t>
-      </w:r>
-    </w:p>
-    <w:p>
-      <w:pPr>
-        <w:pStyle w:val="BodyText"/>
-      </w:pPr>
-      <w:r>
-        <w:t xml:space="preserve">Meyers, G. 2019.</w:t>
-      </w:r>
-      <w:r>
-        <w:t xml:space="preserve"> </w:t>
-      </w:r>
-      <w:r>
-        <w:t xml:space="preserve">“A Cost-of-Capital Risk Margin Formula for Nonlife Insurance Liabilities.”</w:t>
-      </w:r>
-      <w:r>
-        <w:t xml:space="preserve"> </w:t>
-      </w:r>
-      <w:r>
-        <w:t xml:space="preserve">Variance 12 (2).</w:t>
-      </w:r>
-    </w:p>
-    <w:p>
-      <w:pPr>
-        <w:pStyle w:val="BodyText"/>
-      </w:pPr>
-      <w:r>
-        <w:t xml:space="preserve">Sahasrabuddhe, R. 2021.</w:t>
-      </w:r>
-      <w:r>
-        <w:t xml:space="preserve"> </w:t>
-      </w:r>
-      <w:r>
-        <w:t xml:space="preserve">“The Single Parameter Pareto Revisited.”</w:t>
-      </w:r>
-      <w:r>
-        <w:t xml:space="preserve"> </w:t>
-      </w:r>
-      <w:r>
-        <w:t xml:space="preserve">Casualty Actuarial Society E-Forum, Spring 2021.</w:t>
-      </w:r>
-    </w:p>
-    <w:p>
-      <w:pPr>
-        <w:pStyle w:val="BodyText"/>
-      </w:pPr>
-      <w:r>
-        <w:t xml:space="preserve">Schmid, F. 2013.</w:t>
-      </w:r>
-      <w:r>
-        <w:t xml:space="preserve"> </w:t>
-      </w:r>
-      <w:r>
-        <w:t xml:space="preserve">“Bayesian Trend Selection.”</w:t>
-      </w:r>
-      <w:r>
-        <w:t xml:space="preserve"> </w:t>
-      </w:r>
-      <w:r>
-        <w:t xml:space="preserve">Casualty Actuarial Society E-Forum, Spring 2013.</w:t>
-      </w:r>
-    </w:p>
-    <w:p>
-      <w:pPr>
-        <w:pStyle w:val="BodyText"/>
-      </w:pPr>
-      <w:r>
-        <w:t xml:space="preserve">Venter, Gary, and Rajesh Sahasrabuddhe. 2015.</w:t>
-      </w:r>
-      <w:r>
-        <w:t xml:space="preserve"> </w:t>
-      </w:r>
-      <w:r>
-        <w:t xml:space="preserve">“A Note on Parameter Risk.”</w:t>
-      </w:r>
-      <w:r>
-        <w:t xml:space="preserve"> </w:t>
-      </w:r>
-      <w:r>
-        <w:t xml:space="preserve">Variance 9 (1).</w:t>
-      </w:r>
-    </w:p>
-    <w:p>
-      <w:pPr>
-        <w:pStyle w:val="BodyText"/>
-      </w:pPr>
-      <w:r>
-        <w:t xml:space="preserve">Verrall, R. J. 2007.</w:t>
-      </w:r>
-      <w:r>
-        <w:t xml:space="preserve"> </w:t>
-      </w:r>
-      <w:r>
-        <w:t xml:space="preserve">“Obtaining Predictive Distributions for Reserves Which Incorporate Expert Opinion.”</w:t>
-      </w:r>
-      <w:r>
-        <w:t xml:space="preserve"> </w:t>
-      </w:r>
-      <w:r>
-        <w:t xml:space="preserve">Variance 1 (1).</w:t>
-      </w:r>
-    </w:p>
-    <w:bookmarkEnd w:id="61"/>
-    <w:bookmarkStart w:id="70" w:name="r-packages"/>
-    <w:p>
-      <w:pPr>
-        <w:pStyle w:val="Heading2"/>
-      </w:pPr>
-      <w:r>
-        <w:t xml:space="preserve">6.5 R Packages</w:t>
-      </w:r>
-    </w:p>
-    <w:p>
-      <w:pPr>
-        <w:pStyle w:val="FirstParagraph"/>
-      </w:pPr>
-      <w:r>
-        <w:t xml:space="preserve">Barrett, Tyson, Matt Dowle, Arun Srinivasan, Jan Gorecki, Michael Chirico, Toby Hocking, Benjamin Schwendinger, and Ivan Krylov. 2025.</w:t>
-      </w:r>
-      <w:r>
-        <w:t xml:space="preserve"> </w:t>
-      </w:r>
-      <w:r>
-        <w:t xml:space="preserve">“Data.table: Extension of</w:t>
-      </w:r>
-      <w:r>
-        <w:t xml:space="preserve"> </w:t>
-      </w:r>
-      <w:r>
-        <w:t xml:space="preserve">‘Data.frame’</w:t>
-      </w:r>
-      <w:r>
-        <w:t xml:space="preserve">.”</w:t>
-      </w:r>
-      <w:r>
-        <w:t xml:space="preserve"> </w:t>
-      </w:r>
-      <w:hyperlink r:id="rId62">
-        <w:r>
-          <w:rPr>
-            <w:rStyle w:val="Hyperlink"/>
-          </w:rPr>
-          <w:t xml:space="preserve">https://CRAN.Rproject.org/package=data.table</w:t>
-        </w:r>
-      </w:hyperlink>
-      <w:r>
-        <w:t xml:space="preserve">.</w:t>
-      </w:r>
-    </w:p>
-    <w:p>
-      <w:pPr>
-        <w:pStyle w:val="BodyText"/>
-      </w:pPr>
-      <w:r>
-        <w:t xml:space="preserve">Dutang, Christophe, and Arthur Charpentier. 2025.</w:t>
+        <w:t xml:space="preserve">Dutang and Charpentier. 2025.</w:t>
       </w:r>
       <w:r>
         <w:t xml:space="preserve"> </w:t>
@@ -4286,7 +4506,7 @@
       <w:r>
         <w:t xml:space="preserve"> </w:t>
       </w:r>
-      <w:hyperlink r:id="rId63">
+      <w:hyperlink r:id="rId39">
         <w:r>
           <w:rPr>
             <w:rStyle w:val="Hyperlink"/>
@@ -4303,27 +4523,19 @@
         <w:pStyle w:val="BodyText"/>
       </w:pPr>
       <w:r>
-        <w:t xml:space="preserve">Garrett Grolemund, Hadley Wickham. 2011.</w:t>
-      </w:r>
-      <w:r>
-        <w:t xml:space="preserve"> </w:t>
-      </w:r>
-      <w:r>
-        <w:t xml:space="preserve">“Dates and Times Made Easy with lubridate.”</w:t>
-      </w:r>
-      <w:r>
-        <w:t xml:space="preserve"> </w:t>
-      </w:r>
-      <w:hyperlink r:id="rId64">
-        <w:r>
-          <w:rPr>
-            <w:rStyle w:val="Hyperlink"/>
-          </w:rPr>
-          <w:t xml:space="preserve">https://www.jstatsoft.org/v40/i03/</w:t>
-        </w:r>
-      </w:hyperlink>
-      <w:r>
-        <w:t xml:space="preserve">.</w:t>
+        <w:t xml:space="preserve">Meyers. 2015.</w:t>
+      </w:r>
+      <w:r>
+        <w:t xml:space="preserve"> </w:t>
+      </w:r>
+      <w:r>
+        <w:t xml:space="preserve">“Stochastic Loss Reserving Using Bayesian MCMC Models.”</w:t>
+      </w:r>
+      <w:r>
+        <w:t xml:space="preserve"> </w:t>
+      </w:r>
+      <w:r>
+        <w:t xml:space="preserve">CAS Monograph #1.</w:t>
       </w:r>
     </w:p>
     <w:p>
@@ -4331,27 +4543,19 @@
         <w:pStyle w:val="BodyText"/>
       </w:pPr>
       <w:r>
-        <w:t xml:space="preserve">Gohel D, Skintzos P. 2026.</w:t>
-      </w:r>
-      <w:r>
-        <w:t xml:space="preserve"> </w:t>
-      </w:r>
-      <w:r>
-        <w:t xml:space="preserve">“flextable: Functions for Tabular Reporting.”</w:t>
-      </w:r>
-      <w:r>
-        <w:t xml:space="preserve"> </w:t>
-      </w:r>
-      <w:hyperlink r:id="rId65">
-        <w:r>
-          <w:rPr>
-            <w:rStyle w:val="Hyperlink"/>
-          </w:rPr>
-          <w:t xml:space="preserve">https://CRAN.R-project.org/package=flextable</w:t>
-        </w:r>
-      </w:hyperlink>
-      <w:r>
-        <w:t xml:space="preserve">.</w:t>
+        <w:t xml:space="preserve">Meyers. 2019.</w:t>
+      </w:r>
+      <w:r>
+        <w:t xml:space="preserve"> </w:t>
+      </w:r>
+      <w:r>
+        <w:t xml:space="preserve">“A Cost-of-Capital Risk Margin Formula for Nonlife Insurance Liabilities.”</w:t>
+      </w:r>
+      <w:r>
+        <w:t xml:space="preserve"> </w:t>
+      </w:r>
+      <w:r>
+        <w:t xml:space="preserve">Variance 12 (2).</w:t>
       </w:r>
     </w:p>
     <w:p>
@@ -4359,6 +4563,67 @@
         <w:pStyle w:val="BodyText"/>
       </w:pPr>
       <w:r>
+        <w:t xml:space="preserve">Patrick. 2018.</w:t>
+      </w:r>
+      <w:r>
+        <w:t xml:space="preserve"> </w:t>
+      </w:r>
+      <w:r>
+        <w:rPr>
+          <w:i/>
+          <w:iCs/>
+        </w:rPr>
+        <w:t xml:space="preserve">MCMC Algorithms</w:t>
+      </w:r>
+      <w:r>
+        <w:t xml:space="preserve">. Casualty Actuarial Society, April 2018.</w:t>
+      </w:r>
+    </w:p>
+    <w:p>
+      <w:pPr>
+        <w:pStyle w:val="BodyText"/>
+      </w:pPr>
+      <w:r>
+        <w:t xml:space="preserve">Sahasrabuddhe. 2021.</w:t>
+      </w:r>
+      <w:r>
+        <w:t xml:space="preserve"> </w:t>
+      </w:r>
+      <w:r>
+        <w:t xml:space="preserve">“The Single Parameter Pareto Revisited.”</w:t>
+      </w:r>
+      <w:r>
+        <w:t xml:space="preserve"> </w:t>
+      </w:r>
+      <w:r>
+        <w:t xml:space="preserve">Casualty Actuarial Society E-Forum, Spring 2021.</w:t>
+      </w:r>
+    </w:p>
+    <w:p>
+      <w:pPr>
+        <w:pStyle w:val="BodyText"/>
+      </w:pPr>
+      <w:r>
+        <w:t xml:space="preserve">Schmid. 2013.</w:t>
+      </w:r>
+      <w:r>
+        <w:t xml:space="preserve"> </w:t>
+      </w:r>
+      <w:r>
+        <w:t xml:space="preserve">“Bayesian Trend Selection.”</w:t>
+      </w:r>
+      <w:r>
+        <w:t xml:space="preserve"> </w:t>
+      </w:r>
+      <w:r>
+        <w:t xml:space="preserve">Casualty Actuarial Society E-Forum, Spring 2013.</w:t>
+      </w:r>
+    </w:p>
+    <w:p>
+      <w:pPr>
+        <w:pStyle w:val="BodyText"/>
+      </w:pPr>
+      <w:r>
         <w:t xml:space="preserve">Stan Development Team. 2025.</w:t>
       </w:r>
       <w:r>
@@ -4370,7 +4635,7 @@
       <w:r>
         <w:t xml:space="preserve"> </w:t>
       </w:r>
-      <w:hyperlink r:id="rId66">
+      <w:hyperlink r:id="rId40">
         <w:r>
           <w:rPr>
             <w:rStyle w:val="Hyperlink"/>
@@ -4387,27 +4652,19 @@
         <w:pStyle w:val="BodyText"/>
       </w:pPr>
       <w:r>
-        <w:t xml:space="preserve">Wickham, Hadley. 2016.</w:t>
-      </w:r>
-      <w:r>
-        <w:t xml:space="preserve"> </w:t>
-      </w:r>
-      <w:r>
-        <w:t xml:space="preserve">“ggplot2: Elegant Graphics for Data Analysis.”</w:t>
-      </w:r>
-      <w:r>
-        <w:t xml:space="preserve"> </w:t>
-      </w:r>
-      <w:hyperlink r:id="rId67">
-        <w:r>
-          <w:rPr>
-            <w:rStyle w:val="Hyperlink"/>
-          </w:rPr>
-          <w:t xml:space="preserve">https://ggplot2.tidyverse.org</w:t>
-        </w:r>
-      </w:hyperlink>
-      <w:r>
-        <w:t xml:space="preserve">.</w:t>
+        <w:t xml:space="preserve">Tversky and Kahneman. 1974.</w:t>
+      </w:r>
+      <w:r>
+        <w:t xml:space="preserve"> </w:t>
+      </w:r>
+      <w:r>
+        <w:t xml:space="preserve">“Judgment Under Uncertainty: Heuristics and Biases.”</w:t>
+      </w:r>
+      <w:r>
+        <w:t xml:space="preserve"> </w:t>
+      </w:r>
+      <w:r>
+        <w:t xml:space="preserve">Science 185, 1124-1131.</w:t>
       </w:r>
     </w:p>
     <w:p>
@@ -4415,30 +4672,19 @@
         <w:pStyle w:val="BodyText"/>
       </w:pPr>
       <w:r>
-        <w:t xml:space="preserve">Wickham H, Henry L. 2026.</w:t>
-      </w:r>
-      <w:r>
-        <w:t xml:space="preserve"> </w:t>
-      </w:r>
-      <w:r>
-        <w:t xml:space="preserve">“purrr: Functional Programming Tools”</w:t>
-      </w:r>
-      <w:r>
-        <w:t xml:space="preserve">.</w:t>
-      </w:r>
-      <w:r>
-        <w:t xml:space="preserve"> </w:t>
-      </w:r>
-      <w:hyperlink r:id="rId68">
-        <w:r>
-          <w:rPr>
-            <w:rStyle w:val="Hyperlink"/>
-          </w:rPr>
-          <w:t xml:space="preserve">https://CRAN.R-project.org/package=purrr</w:t>
-        </w:r>
-      </w:hyperlink>
-      <w:r>
-        <w:t xml:space="preserve">.</w:t>
+        <w:t xml:space="preserve">Venter and Sahasrabuddhe. 2015.</w:t>
+      </w:r>
+      <w:r>
+        <w:t xml:space="preserve"> </w:t>
+      </w:r>
+      <w:r>
+        <w:t xml:space="preserve">“A Note on Parameter Risk.”</w:t>
+      </w:r>
+      <w:r>
+        <w:t xml:space="preserve"> </w:t>
+      </w:r>
+      <w:r>
+        <w:t xml:space="preserve">Variance 9 (1).</w:t>
       </w:r>
     </w:p>
     <w:p>
@@ -4446,34 +4692,23 @@
         <w:pStyle w:val="BodyText"/>
       </w:pPr>
       <w:r>
-        <w:t xml:space="preserve">Xie Y. 2025.</w:t>
-      </w:r>
-      <w:r>
-        <w:t xml:space="preserve"> </w:t>
-      </w:r>
-      <w:r>
-        <w:t xml:space="preserve">“knitr: A General-Purpose Package for Dynamic Report Generation in R”</w:t>
-      </w:r>
-      <w:r>
-        <w:t xml:space="preserve">.</w:t>
-      </w:r>
-      <w:r>
-        <w:t xml:space="preserve"> </w:t>
-      </w:r>
-      <w:hyperlink r:id="rId69">
-        <w:r>
-          <w:rPr>
-            <w:rStyle w:val="Hyperlink"/>
-          </w:rPr>
-          <w:t xml:space="preserve">https://yihui.org/knitr/</w:t>
-        </w:r>
-      </w:hyperlink>
-      <w:r>
-        <w:t xml:space="preserve">.</w:t>
-      </w:r>
-    </w:p>
-    <w:bookmarkEnd w:id="70"/>
-    <w:bookmarkEnd w:id="71"/>
+        <w:t xml:space="preserve">Verrall. 2007.</w:t>
+      </w:r>
+      <w:r>
+        <w:t xml:space="preserve"> </w:t>
+      </w:r>
+      <w:r>
+        <w:t xml:space="preserve">“Obtaining Predictive Distributions for Reserves Which Incorporate Expert Opinion.”</w:t>
+      </w:r>
+      <w:r>
+        <w:t xml:space="preserve"> </w:t>
+      </w:r>
+      <w:r>
+        <w:t xml:space="preserve">Variance 1 (1).</w:t>
+      </w:r>
+    </w:p>
+    <w:bookmarkEnd w:id="41"/>
+    <w:bookmarkEnd w:id="42"/>
     <w:sectPr>
       <w:pgSz w:h="15840" w:w="12240"/>
       <w:pgMar w:bottom="1440" w:footer="720" w:gutter="0" w:header="720" w:left="1440" w:right="1440" w:top="1440"/>
@@ -4503,7 +4738,7 @@
       </w:r>
     </w:p>
   </w:footnote>
-  <w:footnote w:id="56">
+  <w:footnote w:id="36">
     <w:p>
       <w:pPr>
         <w:pStyle w:val="FootnoteText"/>
@@ -4518,7 +4753,7 @@
         <w:t xml:space="preserve"> </w:t>
       </w:r>
       <w:r>
-        <w:t xml:space="preserve">We should note that it is relitively easy to also incorporate model risk into Bayesian MCMC models. With regards to the example above, one could run a second model that assumes a negative binomial frequency distribution and weight the results together.</w:t>
+        <w:t xml:space="preserve">We should note that it is relatively easy to also incorporate model risk into Bayesian MCMC models. With regards to the example above, one could run a second model that assumes a negative binomial frequency distribution and weight the results together.</w:t>
       </w:r>
     </w:p>
   </w:footnote>
@@ -4526,7 +4761,7 @@
 </file>
 
 <file path=word/numbering.xml><?xml version="1.0" encoding="utf-8"?>
-<w:numbering xmlns:aink="http://schemas.microsoft.com/office/drawing/2016/ink" xmlns:am3d="http://schemas.microsoft.com/office/drawing/2017/model3d" xmlns:cx="http://schemas.microsoft.com/office/drawing/2014/chartex" xmlns:cx1="http://schemas.microsoft.com/office/drawing/2015/9/8/chartex" xmlns:cx2="http://schemas.microsoft.com/office/drawing/2015/10/21/chartex" xmlns:cx3="http://schemas.microsoft.com/office/drawing/2016/5/9/chartex" xmlns:cx4="http://schemas.microsoft.com/office/drawing/2016/5/10/chartex" xmlns:cx5="http://schemas.microsoft.com/office/drawing/2016/5/11/chartex" xmlns:cx6="http://schemas.microsoft.com/office/drawing/2016/5/12/chartex" xmlns:cx7="http://schemas.microsoft.com/office/drawing/2016/5/13/chartex" xmlns:cx8="http://schemas.microsoft.com/office/drawing/2016/5/14/chartex" xmlns:m="http://schemas.openxmlformats.org/officeDocument/2006/math" xmlns:mc="http://schemas.openxmlformats.org/markup-compatibility/2006" xmlns:o="urn:schemas-microsoft-com:office:office" xmlns:oel="http://schemas.microsoft.com/office/2019/extlst" xmlns:r="http://schemas.openxmlformats.org/officeDocument/2006/relationships" xmlns:v="urn:schemas-microsoft-com:vml" xmlns:w="http://schemas.openxmlformats.org/wordprocessingml/2006/main" xmlns:w10="urn:schemas-microsoft-com:office:word" xmlns:w14="http://schemas.microsoft.com/office/word/2010/wordml" xmlns:w15="http://schemas.microsoft.com/office/word/2012/wordml" xmlns:w16="http://schemas.microsoft.com/office/word/2018/wordml" xmlns:w16cei="http://schemas.microsoft.com/office/word/2026/wordml/cei" xmlns:w16cex="http://schemas.microsoft.com/office/word/2018/wordml/cex" xmlns:w16cid="http://schemas.microsoft.com/office/word/2016/wordml/cid" xmlns:w16du="http://schemas.microsoft.com/office/word/2023/wordml/word16du" xmlns:w16sdtdh="http://schemas.microsoft.com/office/word/2020/wordml/sdtdatahash" xmlns:w16sdtfl="http://schemas.microsoft.com/office/word/2024/wordml/sdtformatlock" xmlns:w16se="http://schemas.microsoft.com/office/word/2015/wordml/symex" xmlns:wne="http://schemas.microsoft.com/office/word/2006/wordml" xmlns:wp="http://schemas.openxmlformats.org/drawingml/2006/wordprocessingDrawing" xmlns:wp14="http://schemas.microsoft.com/office/word/2010/wordprocessingDrawing" xmlns:wpc="http://schemas.microsoft.com/office/word/2010/wordprocessingCanvas" xmlns:wpg="http://schemas.microsoft.com/office/word/2010/wordprocessingGroup" xmlns:wpi="http://schemas.microsoft.com/office/word/2010/wordprocessingInk" xmlns:wps="http://schemas.microsoft.com/office/word/2010/wordprocessingShape" mc:Ignorable="w14 w15 w16se w16cid w16 w16cex w16sdtdh w16sdtfl w16du wp14">
+<w:numbering xmlns:aink="http://schemas.microsoft.com/office/drawing/2016/ink" xmlns:am3d="http://schemas.microsoft.com/office/drawing/2017/model3d" xmlns:cx="http://schemas.microsoft.com/office/drawing/2014/chartex" xmlns:cx1="http://schemas.microsoft.com/office/drawing/2015/9/8/chartex" xmlns:cx2="http://schemas.microsoft.com/office/drawing/2015/10/21/chartex" xmlns:cx3="http://schemas.microsoft.com/office/drawing/2016/5/9/chartex" xmlns:cx4="http://schemas.microsoft.com/office/drawing/2016/5/10/chartex" xmlns:cx5="http://schemas.microsoft.com/office/drawing/2016/5/11/chartex" xmlns:cx6="http://schemas.microsoft.com/office/drawing/2016/5/12/chartex" xmlns:cx7="http://schemas.microsoft.com/office/drawing/2016/5/13/chartex" xmlns:cx8="http://schemas.microsoft.com/office/drawing/2016/5/14/chartex" xmlns:m="http://schemas.openxmlformats.org/officeDocument/2006/math" xmlns:mc="http://schemas.openxmlformats.org/markup-compatibility/2006" xmlns:o="urn:schemas-microsoft-com:office:office" xmlns:oel="http://schemas.microsoft.com/office/2019/extlst" xmlns:r="http://schemas.openxmlformats.org/officeDocument/2006/relationships" xmlns:v="urn:schemas-microsoft-com:vml" xmlns:w="http://schemas.openxmlformats.org/wordprocessingml/2006/main" xmlns:w10="urn:schemas-microsoft-com:office:word" xmlns:w14="http://schemas.microsoft.com/office/word/2010/wordml" xmlns:w15="http://schemas.microsoft.com/office/word/2012/wordml" xmlns:w16="http://schemas.microsoft.com/office/word/2018/wordml" xmlns:w16cex="http://schemas.microsoft.com/office/word/2018/wordml/cex" xmlns:w16cid="http://schemas.microsoft.com/office/word/2016/wordml/cid" xmlns:w16du="http://schemas.microsoft.com/office/word/2023/wordml/word16du" xmlns:w16sdtdh="http://schemas.microsoft.com/office/word/2020/wordml/sdtdatahash" xmlns:w16sdtfl="http://schemas.microsoft.com/office/word/2024/wordml/sdtformatlock" xmlns:w16se="http://schemas.microsoft.com/office/word/2015/wordml/symex" xmlns:wne="http://schemas.microsoft.com/office/word/2006/wordml" xmlns:wp="http://schemas.openxmlformats.org/drawingml/2006/wordprocessingDrawing" xmlns:wp14="http://schemas.microsoft.com/office/word/2010/wordprocessingDrawing" xmlns:wpc="http://schemas.microsoft.com/office/word/2010/wordprocessingCanvas" xmlns:wpg="http://schemas.microsoft.com/office/word/2010/wordprocessingGroup" xmlns:wpi="http://schemas.microsoft.com/office/word/2010/wordprocessingInk" xmlns:wps="http://schemas.microsoft.com/office/word/2010/wordprocessingShape" mc:Ignorable="w14 w15 w16se w16cid w16 w16cex w16sdtdh w16sdtfl w16du wp14">
   <w:abstractNum w15:restartNumberingAfterBreak="0" w:abstractNumId="0">
     <w:nsid w:val="0000A990"/>
     <w:multiLevelType w:val="multilevel"/>
@@ -5814,6 +6049,11 @@
   <w:style w:customStyle="1" w:styleId="ImageCaption" w:type="paragraph">
     <w:name w:val="Image Caption"/>
     <w:basedOn w:val="Caption"/>
+    <w:rsid w:val="004E3A20"/>
+    <w:pPr>
+      <w:keepNext/>
+      <w:jc w:val="center"/>
+    </w:pPr>
   </w:style>
   <w:style w:customStyle="1" w:styleId="Figure" w:type="paragraph">
     <w:name w:val="Figure"/>

</xml_diff>